<commit_message>
Sua loi Word khong mo duoc file bao cao (insufficient memory)
Nguyen nhan: helper shade() va borders() dung pPr.append() nen the w:shd
va w:pBdr bi dat sau w:spacing / w:ind / w:jc. Schema OOXML quy dinh
thu tu cac phan tu con cua w:pPr, Word tu choi mo file va bao sai la
"insufficient memory" (python-docx va textutil van doc duoc nen khong phat hien som).

- Them PPR_TAG_SEQ va insert_in_order(), chen w:shd/w:pBdr dung vi tri
- Da kiem tra lai: 0/75 khoi sai thu tu, kiem tra ca pPr, rPr, trPr, tcPr, tblPr
- Doi font ma nguon tu Consolas (khong co tren macOS) sang Courier New
- Dat thuoc tinh file: Author/Title la Nhom 14 thay cho python-docx
</commit_message>
<xml_diff>
--- a/BAO-CAO-TIEN-DO-NHOM14.docx
+++ b/BAO-CAO-TIEN-DO-NHOM14.docx
@@ -104,8 +104,8 @@
           </w:tcPr>
           <w:p>
             <w:pPr>
+              <w:shd w:val="clear" w:fill="DCEDEA"/>
               <w:spacing w:after="40"/>
-              <w:shd w:val="clear" w:fill="DCEDEA"/>
             </w:pPr>
             <w:r/>
             <w:r>
@@ -122,8 +122,8 @@
           </w:tcPr>
           <w:p>
             <w:pPr>
+              <w:shd w:val="clear" w:fill="DCEDEA"/>
               <w:spacing w:after="40"/>
-              <w:shd w:val="clear" w:fill="DCEDEA"/>
             </w:pPr>
             <w:r/>
             <w:r>
@@ -441,8 +441,8 @@
           </w:tcPr>
           <w:p>
             <w:pPr>
+              <w:shd w:val="clear" w:fill="DCEDEA"/>
               <w:spacing w:after="40"/>
-              <w:shd w:val="clear" w:fill="DCEDEA"/>
             </w:pPr>
             <w:r/>
             <w:r>
@@ -460,8 +460,8 @@
           </w:tcPr>
           <w:p>
             <w:pPr>
+              <w:shd w:val="clear" w:fill="DCEDEA"/>
               <w:spacing w:after="40"/>
-              <w:shd w:val="clear" w:fill="DCEDEA"/>
             </w:pPr>
             <w:r/>
             <w:r>
@@ -1088,8 +1088,8 @@
           </w:tcPr>
           <w:p>
             <w:pPr>
+              <w:shd w:val="clear" w:fill="DCEDEA"/>
               <w:spacing w:after="40"/>
-              <w:shd w:val="clear" w:fill="DCEDEA"/>
             </w:pPr>
             <w:r/>
             <w:r>
@@ -1107,8 +1107,8 @@
           </w:tcPr>
           <w:p>
             <w:pPr>
+              <w:shd w:val="clear" w:fill="DCEDEA"/>
               <w:spacing w:after="40"/>
-              <w:shd w:val="clear" w:fill="DCEDEA"/>
             </w:pPr>
             <w:r/>
             <w:r>
@@ -1126,8 +1126,8 @@
           </w:tcPr>
           <w:p>
             <w:pPr>
+              <w:shd w:val="clear" w:fill="DCEDEA"/>
               <w:spacing w:after="40"/>
-              <w:shd w:val="clear" w:fill="DCEDEA"/>
             </w:pPr>
             <w:r/>
             <w:r>
@@ -1622,8 +1622,8 @@
           </w:tcPr>
           <w:p>
             <w:pPr>
+              <w:shd w:val="clear" w:fill="DCEDEA"/>
               <w:spacing w:after="40"/>
-              <w:shd w:val="clear" w:fill="DCEDEA"/>
             </w:pPr>
             <w:r/>
             <w:r>
@@ -1641,8 +1641,8 @@
           </w:tcPr>
           <w:p>
             <w:pPr>
+              <w:shd w:val="clear" w:fill="DCEDEA"/>
               <w:spacing w:after="40"/>
-              <w:shd w:val="clear" w:fill="DCEDEA"/>
             </w:pPr>
             <w:r/>
             <w:r>
@@ -1897,8 +1897,8 @@
           </w:tcPr>
           <w:p>
             <w:pPr>
+              <w:shd w:val="clear" w:fill="DCEDEA"/>
               <w:spacing w:after="40"/>
-              <w:shd w:val="clear" w:fill="DCEDEA"/>
             </w:pPr>
             <w:r/>
             <w:r>
@@ -1916,8 +1916,8 @@
           </w:tcPr>
           <w:p>
             <w:pPr>
+              <w:shd w:val="clear" w:fill="DCEDEA"/>
               <w:spacing w:after="40"/>
-              <w:shd w:val="clear" w:fill="DCEDEA"/>
             </w:pPr>
             <w:r/>
             <w:r>
@@ -1935,8 +1935,8 @@
           </w:tcPr>
           <w:p>
             <w:pPr>
+              <w:shd w:val="clear" w:fill="DCEDEA"/>
               <w:spacing w:after="40"/>
-              <w:shd w:val="clear" w:fill="DCEDEA"/>
             </w:pPr>
             <w:r/>
             <w:r>
@@ -2442,19 +2442,19 @@
     </w:p>
     <w:p>
       <w:pPr>
-        <w:spacing w:before="120" w:after="120" w:line="264" w:lineRule="auto"/>
-        <w:ind w:left="170"/>
-        <w:shd w:val="clear" w:fill="F4F4F4"/>
         <w:pBdr>
           <w:top w:val="single" w:sz="6" w:space="4" w:color="C9C9C9"/>
           <w:left w:val="single" w:sz="6" w:space="4" w:color="C9C9C9"/>
           <w:bottom w:val="single" w:sz="6" w:space="4" w:color="C9C9C9"/>
           <w:right w:val="single" w:sz="6" w:space="4" w:color="C9C9C9"/>
         </w:pBdr>
-      </w:pPr>
-      <w:r>
-        <w:rPr>
-          <w:rFonts w:ascii="Consolas" w:hAnsi="Consolas" w:eastAsia="Consolas"/>
+        <w:shd w:val="clear" w:fill="F4F4F4"/>
+        <w:spacing w:before="120" w:after="120" w:line="264" w:lineRule="auto"/>
+        <w:ind w:left="170"/>
+      </w:pPr>
+      <w:r>
+        <w:rPr>
+          <w:rFonts w:ascii="Courier New" w:hAnsi="Courier New" w:eastAsia="Courier New"/>
           <w:sz w:val="19"/>
         </w:rPr>
         <w:t xml:space="preserve">                     Trinh duyet</w:t>
@@ -2462,7 +2462,7 @@
       </w:r>
       <w:r>
         <w:rPr>
-          <w:rFonts w:ascii="Consolas" w:hAnsi="Consolas" w:eastAsia="Consolas"/>
+          <w:rFonts w:ascii="Courier New" w:hAnsi="Courier New" w:eastAsia="Courier New"/>
           <w:sz w:val="19"/>
         </w:rPr>
         <w:t xml:space="preserve">                          |</w:t>
@@ -2470,7 +2470,7 @@
       </w:r>
       <w:r>
         <w:rPr>
-          <w:rFonts w:ascii="Consolas" w:hAnsi="Consolas" w:eastAsia="Consolas"/>
+          <w:rFonts w:ascii="Courier New" w:hAnsi="Courier New" w:eastAsia="Courier New"/>
           <w:sz w:val="19"/>
         </w:rPr>
         <w:t xml:space="preserve">              Frontend Next.js  (cong 3000)</w:t>
@@ -2478,7 +2478,7 @@
       </w:r>
       <w:r>
         <w:rPr>
-          <w:rFonts w:ascii="Consolas" w:hAnsi="Consolas" w:eastAsia="Consolas"/>
+          <w:rFonts w:ascii="Courier New" w:hAnsi="Courier New" w:eastAsia="Courier New"/>
           <w:sz w:val="19"/>
         </w:rPr>
         <w:t xml:space="preserve">                          |</w:t>
@@ -2486,7 +2486,7 @@
       </w:r>
       <w:r>
         <w:rPr>
-          <w:rFonts w:ascii="Consolas" w:hAnsi="Consolas" w:eastAsia="Consolas"/>
+          <w:rFonts w:ascii="Courier New" w:hAnsi="Courier New" w:eastAsia="Courier New"/>
           <w:sz w:val="19"/>
         </w:rPr>
         <w:t xml:space="preserve">              API Gateway       (cong 8080)</w:t>
@@ -2494,7 +2494,7 @@
       </w:r>
       <w:r>
         <w:rPr>
-          <w:rFonts w:ascii="Consolas" w:hAnsi="Consolas" w:eastAsia="Consolas"/>
+          <w:rFonts w:ascii="Courier New" w:hAnsi="Courier New" w:eastAsia="Courier New"/>
           <w:sz w:val="19"/>
         </w:rPr>
         <w:t xml:space="preserve">    ______________________|______________________</w:t>
@@ -2502,7 +2502,7 @@
       </w:r>
       <w:r>
         <w:rPr>
-          <w:rFonts w:ascii="Consolas" w:hAnsi="Consolas" w:eastAsia="Consolas"/>
+          <w:rFonts w:ascii="Courier New" w:hAnsi="Courier New" w:eastAsia="Courier New"/>
           <w:sz w:val="19"/>
         </w:rPr>
         <w:t xml:space="preserve">   |         |            |           |          |</w:t>
@@ -2510,7 +2510,7 @@
       </w:r>
       <w:r>
         <w:rPr>
-          <w:rFonts w:ascii="Consolas" w:hAnsi="Consolas" w:eastAsia="Consolas"/>
+          <w:rFonts w:ascii="Courier New" w:hAnsi="Courier New" w:eastAsia="Courier New"/>
           <w:sz w:val="19"/>
         </w:rPr>
         <w:t xml:space="preserve"> auth      user        product      store      order</w:t>
@@ -2518,7 +2518,7 @@
       </w:r>
       <w:r>
         <w:rPr>
-          <w:rFonts w:ascii="Consolas" w:hAnsi="Consolas" w:eastAsia="Consolas"/>
+          <w:rFonts w:ascii="Courier New" w:hAnsi="Courier New" w:eastAsia="Courier New"/>
           <w:sz w:val="19"/>
         </w:rPr>
         <w:t xml:space="preserve"> :8081     :8082        :8083       :8084      :8085</w:t>
@@ -2526,7 +2526,7 @@
       </w:r>
       <w:r>
         <w:rPr>
-          <w:rFonts w:ascii="Consolas" w:hAnsi="Consolas" w:eastAsia="Consolas"/>
+          <w:rFonts w:ascii="Courier New" w:hAnsi="Courier New" w:eastAsia="Courier New"/>
           <w:sz w:val="19"/>
         </w:rPr>
         <w:t xml:space="preserve">   |         |            |           |          |</w:t>
@@ -2534,7 +2534,7 @@
       </w:r>
       <w:r>
         <w:rPr>
-          <w:rFonts w:ascii="Consolas" w:hAnsi="Consolas" w:eastAsia="Consolas"/>
+          <w:rFonts w:ascii="Courier New" w:hAnsi="Courier New" w:eastAsia="Courier New"/>
           <w:sz w:val="19"/>
         </w:rPr>
         <w:t xml:space="preserve"> MySQL     MySQL        MySQL       MySQL    MySQL + Redis</w:t>
@@ -2542,7 +2542,7 @@
       </w:r>
       <w:r>
         <w:rPr>
-          <w:rFonts w:ascii="Consolas" w:hAnsi="Consolas" w:eastAsia="Consolas"/>
+          <w:rFonts w:ascii="Courier New" w:hAnsi="Courier New" w:eastAsia="Courier New"/>
           <w:sz w:val="19"/>
         </w:rPr>
         <w:t xml:space="preserve"> db_auth   db_user     db_product  db_store    db_order</w:t>
@@ -2601,8 +2601,8 @@
           </w:tcPr>
           <w:p>
             <w:pPr>
+              <w:shd w:val="clear" w:fill="DCEDEA"/>
               <w:spacing w:after="40"/>
-              <w:shd w:val="clear" w:fill="DCEDEA"/>
             </w:pPr>
             <w:r/>
             <w:r>
@@ -2620,8 +2620,8 @@
           </w:tcPr>
           <w:p>
             <w:pPr>
+              <w:shd w:val="clear" w:fill="DCEDEA"/>
               <w:spacing w:after="40"/>
-              <w:shd w:val="clear" w:fill="DCEDEA"/>
             </w:pPr>
             <w:r/>
             <w:r>
@@ -2639,8 +2639,8 @@
           </w:tcPr>
           <w:p>
             <w:pPr>
+              <w:shd w:val="clear" w:fill="DCEDEA"/>
               <w:spacing w:after="40"/>
-              <w:shd w:val="clear" w:fill="DCEDEA"/>
             </w:pPr>
             <w:r/>
             <w:r>
@@ -2991,7 +2991,7 @@
       </w:r>
       <w:r>
         <w:rPr>
-          <w:rFonts w:ascii="Consolas" w:hAnsi="Consolas" w:eastAsia="Consolas"/>
+          <w:rFonts w:ascii="Courier New" w:hAnsi="Courier New" w:eastAsia="Courier New"/>
           <w:b w:val="0"/>
           <w:i w:val="0"/>
           <w:sz w:val="21"/>
@@ -3042,7 +3042,7 @@
       </w:r>
       <w:r>
         <w:rPr>
-          <w:rFonts w:ascii="Consolas" w:hAnsi="Consolas" w:eastAsia="Consolas"/>
+          <w:rFonts w:ascii="Courier New" w:hAnsi="Courier New" w:eastAsia="Courier New"/>
           <w:b w:val="0"/>
           <w:i w:val="0"/>
           <w:sz w:val="21"/>
@@ -3111,8 +3111,8 @@
           </w:tcPr>
           <w:p>
             <w:pPr>
+              <w:shd w:val="clear" w:fill="DCEDEA"/>
               <w:spacing w:after="40"/>
-              <w:shd w:val="clear" w:fill="DCEDEA"/>
             </w:pPr>
             <w:r/>
             <w:r>
@@ -3130,8 +3130,8 @@
           </w:tcPr>
           <w:p>
             <w:pPr>
+              <w:shd w:val="clear" w:fill="DCEDEA"/>
               <w:spacing w:after="40"/>
-              <w:shd w:val="clear" w:fill="DCEDEA"/>
             </w:pPr>
             <w:r/>
             <w:r>
@@ -3149,8 +3149,8 @@
           </w:tcPr>
           <w:p>
             <w:pPr>
+              <w:shd w:val="clear" w:fill="DCEDEA"/>
               <w:spacing w:after="40"/>
-              <w:shd w:val="clear" w:fill="DCEDEA"/>
             </w:pPr>
             <w:r/>
             <w:r>
@@ -3845,8 +3845,8 @@
           </w:tcPr>
           <w:p>
             <w:pPr>
+              <w:shd w:val="clear" w:fill="DCEDEA"/>
               <w:spacing w:after="40"/>
-              <w:shd w:val="clear" w:fill="DCEDEA"/>
             </w:pPr>
             <w:r/>
             <w:r>
@@ -3864,8 +3864,8 @@
           </w:tcPr>
           <w:p>
             <w:pPr>
+              <w:shd w:val="clear" w:fill="DCEDEA"/>
               <w:spacing w:after="40"/>
-              <w:shd w:val="clear" w:fill="DCEDEA"/>
             </w:pPr>
             <w:r/>
             <w:r>
@@ -3883,8 +3883,8 @@
           </w:tcPr>
           <w:p>
             <w:pPr>
+              <w:shd w:val="clear" w:fill="DCEDEA"/>
               <w:spacing w:after="40"/>
-              <w:shd w:val="clear" w:fill="DCEDEA"/>
             </w:pPr>
             <w:r/>
             <w:r>
@@ -4195,8 +4195,8 @@
           </w:tcPr>
           <w:p>
             <w:pPr>
+              <w:shd w:val="clear" w:fill="DCEDEA"/>
               <w:spacing w:after="40"/>
-              <w:shd w:val="clear" w:fill="DCEDEA"/>
             </w:pPr>
             <w:r/>
             <w:r>
@@ -4214,8 +4214,8 @@
           </w:tcPr>
           <w:p>
             <w:pPr>
+              <w:shd w:val="clear" w:fill="DCEDEA"/>
               <w:spacing w:after="40"/>
-              <w:shd w:val="clear" w:fill="DCEDEA"/>
             </w:pPr>
             <w:r/>
             <w:r>
@@ -4233,8 +4233,8 @@
           </w:tcPr>
           <w:p>
             <w:pPr>
+              <w:shd w:val="clear" w:fill="DCEDEA"/>
               <w:spacing w:after="40"/>
-              <w:shd w:val="clear" w:fill="DCEDEA"/>
             </w:pPr>
             <w:r/>
             <w:r>
@@ -4614,19 +4614,19 @@
     </w:p>
     <w:p>
       <w:pPr>
-        <w:spacing w:before="120" w:after="120" w:line="264" w:lineRule="auto"/>
-        <w:ind w:left="170"/>
-        <w:shd w:val="clear" w:fill="F4F4F4"/>
         <w:pBdr>
           <w:top w:val="single" w:sz="6" w:space="4" w:color="C9C9C9"/>
           <w:left w:val="single" w:sz="6" w:space="4" w:color="C9C9C9"/>
           <w:bottom w:val="single" w:sz="6" w:space="4" w:color="C9C9C9"/>
           <w:right w:val="single" w:sz="6" w:space="4" w:color="C9C9C9"/>
         </w:pBdr>
-      </w:pPr>
-      <w:r>
-        <w:rPr>
-          <w:rFonts w:ascii="Consolas" w:hAnsi="Consolas" w:eastAsia="Consolas"/>
+        <w:shd w:val="clear" w:fill="F4F4F4"/>
+        <w:spacing w:before="120" w:after="120" w:line="264" w:lineRule="auto"/>
+        <w:ind w:left="170"/>
+      </w:pPr>
+      <w:r>
+        <w:rPr>
+          <w:rFonts w:ascii="Courier New" w:hAnsi="Courier New" w:eastAsia="Courier New"/>
           <w:sz w:val="19"/>
         </w:rPr>
         <w:t>E-commerce-website/</w:t>
@@ -4634,7 +4634,7 @@
       </w:r>
       <w:r>
         <w:rPr>
-          <w:rFonts w:ascii="Consolas" w:hAnsi="Consolas" w:eastAsia="Consolas"/>
+          <w:rFonts w:ascii="Courier New" w:hAnsi="Courier New" w:eastAsia="Courier New"/>
           <w:sz w:val="19"/>
         </w:rPr>
         <w:t>|-- backend/                     6 ung dung Spring Boot rieng biet</w:t>
@@ -4642,7 +4642,7 @@
       </w:r>
       <w:r>
         <w:rPr>
-          <w:rFonts w:ascii="Consolas" w:hAnsi="Consolas" w:eastAsia="Consolas"/>
+          <w:rFonts w:ascii="Courier New" w:hAnsi="Courier New" w:eastAsia="Courier New"/>
           <w:sz w:val="19"/>
         </w:rPr>
         <w:t>|   |-- api-gateway/             cong vao (:8080)</w:t>
@@ -4650,7 +4650,7 @@
       </w:r>
       <w:r>
         <w:rPr>
-          <w:rFonts w:ascii="Consolas" w:hAnsi="Consolas" w:eastAsia="Consolas"/>
+          <w:rFonts w:ascii="Courier New" w:hAnsi="Courier New" w:eastAsia="Courier New"/>
           <w:sz w:val="19"/>
         </w:rPr>
         <w:t>|   |-- auth-service/            dang nhap, phan quyen (:8081)</w:t>
@@ -4658,7 +4658,7 @@
       </w:r>
       <w:r>
         <w:rPr>
-          <w:rFonts w:ascii="Consolas" w:hAnsi="Consolas" w:eastAsia="Consolas"/>
+          <w:rFonts w:ascii="Courier New" w:hAnsi="Courier New" w:eastAsia="Courier New"/>
           <w:sz w:val="19"/>
         </w:rPr>
         <w:t>|   |-- user-service/            thong tin ca nhan (:8082)</w:t>
@@ -4666,7 +4666,7 @@
       </w:r>
       <w:r>
         <w:rPr>
-          <w:rFonts w:ascii="Consolas" w:hAnsi="Consolas" w:eastAsia="Consolas"/>
+          <w:rFonts w:ascii="Courier New" w:hAnsi="Courier New" w:eastAsia="Courier New"/>
           <w:sz w:val="19"/>
         </w:rPr>
         <w:t>|   |-- product-service/         san pham, khuyen mai (:8083)</w:t>
@@ -4674,7 +4674,7 @@
       </w:r>
       <w:r>
         <w:rPr>
-          <w:rFonts w:ascii="Consolas" w:hAnsi="Consolas" w:eastAsia="Consolas"/>
+          <w:rFonts w:ascii="Courier New" w:hAnsi="Courier New" w:eastAsia="Courier New"/>
           <w:sz w:val="19"/>
         </w:rPr>
         <w:t>|   |-- store-service/           cua hang (:8084)</w:t>
@@ -4682,7 +4682,7 @@
       </w:r>
       <w:r>
         <w:rPr>
-          <w:rFonts w:ascii="Consolas" w:hAnsi="Consolas" w:eastAsia="Consolas"/>
+          <w:rFonts w:ascii="Courier New" w:hAnsi="Courier New" w:eastAsia="Courier New"/>
           <w:sz w:val="19"/>
         </w:rPr>
         <w:t>|   `-- order-service/           gio hang, don hang (:8085)</w:t>
@@ -4690,7 +4690,7 @@
       </w:r>
       <w:r>
         <w:rPr>
-          <w:rFonts w:ascii="Consolas" w:hAnsi="Consolas" w:eastAsia="Consolas"/>
+          <w:rFonts w:ascii="Courier New" w:hAnsi="Courier New" w:eastAsia="Courier New"/>
           <w:sz w:val="19"/>
         </w:rPr>
         <w:t>|-- frontend/                    giao dien Next.js (:3000)</w:t>
@@ -4698,7 +4698,7 @@
       </w:r>
       <w:r>
         <w:rPr>
-          <w:rFonts w:ascii="Consolas" w:hAnsi="Consolas" w:eastAsia="Consolas"/>
+          <w:rFonts w:ascii="Courier New" w:hAnsi="Courier New" w:eastAsia="Courier New"/>
           <w:sz w:val="19"/>
         </w:rPr>
         <w:t>|-- infra/</w:t>
@@ -4706,7 +4706,7 @@
       </w:r>
       <w:r>
         <w:rPr>
-          <w:rFonts w:ascii="Consolas" w:hAnsi="Consolas" w:eastAsia="Consolas"/>
+          <w:rFonts w:ascii="Courier New" w:hAnsi="Courier New" w:eastAsia="Courier New"/>
           <w:sz w:val="19"/>
         </w:rPr>
         <w:t>|   `-- docker-compose.dev.yml   5 MySQL + 1 Redis</w:t>
@@ -4714,7 +4714,7 @@
       </w:r>
       <w:r>
         <w:rPr>
-          <w:rFonts w:ascii="Consolas" w:hAnsi="Consolas" w:eastAsia="Consolas"/>
+          <w:rFonts w:ascii="Courier New" w:hAnsi="Courier New" w:eastAsia="Courier New"/>
           <w:sz w:val="19"/>
         </w:rPr>
         <w:t>|-- README.md</w:t>
@@ -4722,7 +4722,7 @@
       </w:r>
       <w:r>
         <w:rPr>
-          <w:rFonts w:ascii="Consolas" w:hAnsi="Consolas" w:eastAsia="Consolas"/>
+          <w:rFonts w:ascii="Courier New" w:hAnsi="Courier New" w:eastAsia="Courier New"/>
           <w:sz w:val="19"/>
         </w:rPr>
         <w:t>`-- BAO-CAO-TIEN-DO-NHOM14.docx</w:t>
@@ -4755,7 +4755,7 @@
       </w:r>
       <w:r>
         <w:rPr>
-          <w:rFonts w:ascii="Consolas" w:hAnsi="Consolas" w:eastAsia="Consolas"/>
+          <w:rFonts w:ascii="Courier New" w:hAnsi="Courier New" w:eastAsia="Courier New"/>
           <w:b w:val="0"/>
           <w:i w:val="0"/>
           <w:sz w:val="21"/>
@@ -4772,7 +4772,7 @@
       </w:r>
       <w:r>
         <w:rPr>
-          <w:rFonts w:ascii="Consolas" w:hAnsi="Consolas" w:eastAsia="Consolas"/>
+          <w:rFonts w:ascii="Courier New" w:hAnsi="Courier New" w:eastAsia="Courier New"/>
           <w:b w:val="0"/>
           <w:i w:val="0"/>
           <w:sz w:val="21"/>
@@ -4811,19 +4811,19 @@
     </w:p>
     <w:p>
       <w:pPr>
-        <w:spacing w:before="120" w:after="120" w:line="264" w:lineRule="auto"/>
-        <w:ind w:left="170"/>
-        <w:shd w:val="clear" w:fill="F4F4F4"/>
         <w:pBdr>
           <w:top w:val="single" w:sz="6" w:space="4" w:color="C9C9C9"/>
           <w:left w:val="single" w:sz="6" w:space="4" w:color="C9C9C9"/>
           <w:bottom w:val="single" w:sz="6" w:space="4" w:color="C9C9C9"/>
           <w:right w:val="single" w:sz="6" w:space="4" w:color="C9C9C9"/>
         </w:pBdr>
-      </w:pPr>
-      <w:r>
-        <w:rPr>
-          <w:rFonts w:ascii="Consolas" w:hAnsi="Consolas" w:eastAsia="Consolas"/>
+        <w:shd w:val="clear" w:fill="F4F4F4"/>
+        <w:spacing w:before="120" w:after="120" w:line="264" w:lineRule="auto"/>
+        <w:ind w:left="170"/>
+      </w:pPr>
+      <w:r>
+        <w:rPr>
+          <w:rFonts w:ascii="Courier New" w:hAnsi="Courier New" w:eastAsia="Courier New"/>
           <w:sz w:val="19"/>
         </w:rPr>
         <w:t>auth-service/src/main/java/auth_service/</w:t>
@@ -4831,7 +4831,7 @@
       </w:r>
       <w:r>
         <w:rPr>
-          <w:rFonts w:ascii="Consolas" w:hAnsi="Consolas" w:eastAsia="Consolas"/>
+          <w:rFonts w:ascii="Courier New" w:hAnsi="Courier New" w:eastAsia="Courier New"/>
           <w:sz w:val="19"/>
         </w:rPr>
         <w:t>|-- AuthServiceApplication.java    class chay chuong trinh</w:t>
@@ -4839,7 +4839,7 @@
       </w:r>
       <w:r>
         <w:rPr>
-          <w:rFonts w:ascii="Consolas" w:hAnsi="Consolas" w:eastAsia="Consolas"/>
+          <w:rFonts w:ascii="Courier New" w:hAnsi="Courier New" w:eastAsia="Courier New"/>
           <w:sz w:val="19"/>
         </w:rPr>
         <w:t>|-- controller/AuthController.java khai bao cac API</w:t>
@@ -4847,7 +4847,7 @@
       </w:r>
       <w:r>
         <w:rPr>
-          <w:rFonts w:ascii="Consolas" w:hAnsi="Consolas" w:eastAsia="Consolas"/>
+          <w:rFonts w:ascii="Courier New" w:hAnsi="Courier New" w:eastAsia="Courier New"/>
           <w:sz w:val="19"/>
         </w:rPr>
         <w:t>|-- service/AuthService.java       xu ly nghiep vu</w:t>
@@ -4855,7 +4855,7 @@
       </w:r>
       <w:r>
         <w:rPr>
-          <w:rFonts w:ascii="Consolas" w:hAnsi="Consolas" w:eastAsia="Consolas"/>
+          <w:rFonts w:ascii="Courier New" w:hAnsi="Courier New" w:eastAsia="Courier New"/>
           <w:sz w:val="19"/>
         </w:rPr>
         <w:t>|-- repository/AccountRepository.java  truy van database</w:t>
@@ -4863,7 +4863,7 @@
       </w:r>
       <w:r>
         <w:rPr>
-          <w:rFonts w:ascii="Consolas" w:hAnsi="Consolas" w:eastAsia="Consolas"/>
+          <w:rFonts w:ascii="Courier New" w:hAnsi="Courier New" w:eastAsia="Courier New"/>
           <w:sz w:val="19"/>
         </w:rPr>
         <w:t>|-- entity/                        cac class anh xa bang</w:t>
@@ -4871,7 +4871,7 @@
       </w:r>
       <w:r>
         <w:rPr>
-          <w:rFonts w:ascii="Consolas" w:hAnsi="Consolas" w:eastAsia="Consolas"/>
+          <w:rFonts w:ascii="Courier New" w:hAnsi="Courier New" w:eastAsia="Courier New"/>
           <w:sz w:val="19"/>
         </w:rPr>
         <w:t>|   |-- Account.java               bang accounts</w:t>
@@ -4879,7 +4879,7 @@
       </w:r>
       <w:r>
         <w:rPr>
-          <w:rFonts w:ascii="Consolas" w:hAnsi="Consolas" w:eastAsia="Consolas"/>
+          <w:rFonts w:ascii="Courier New" w:hAnsi="Courier New" w:eastAsia="Courier New"/>
           <w:sz w:val="19"/>
         </w:rPr>
         <w:t>|   |-- Role.java                  BUYER / SELLER / ADMIN</w:t>
@@ -4887,7 +4887,7 @@
       </w:r>
       <w:r>
         <w:rPr>
-          <w:rFonts w:ascii="Consolas" w:hAnsi="Consolas" w:eastAsia="Consolas"/>
+          <w:rFonts w:ascii="Courier New" w:hAnsi="Courier New" w:eastAsia="Courier New"/>
           <w:sz w:val="19"/>
         </w:rPr>
         <w:t>|   `-- AccountStatus.java         ACTIVE / LOCKED</w:t>
@@ -4895,7 +4895,7 @@
       </w:r>
       <w:r>
         <w:rPr>
-          <w:rFonts w:ascii="Consolas" w:hAnsi="Consolas" w:eastAsia="Consolas"/>
+          <w:rFonts w:ascii="Courier New" w:hAnsi="Courier New" w:eastAsia="Courier New"/>
           <w:sz w:val="19"/>
         </w:rPr>
         <w:t>|-- dto/                           du lieu vao ra cua API</w:t>
@@ -4903,7 +4903,7 @@
       </w:r>
       <w:r>
         <w:rPr>
-          <w:rFonts w:ascii="Consolas" w:hAnsi="Consolas" w:eastAsia="Consolas"/>
+          <w:rFonts w:ascii="Courier New" w:hAnsi="Courier New" w:eastAsia="Courier New"/>
           <w:sz w:val="19"/>
         </w:rPr>
         <w:t>|   |-- RegisterRequest.java</w:t>
@@ -4911,7 +4911,7 @@
       </w:r>
       <w:r>
         <w:rPr>
-          <w:rFonts w:ascii="Consolas" w:hAnsi="Consolas" w:eastAsia="Consolas"/>
+          <w:rFonts w:ascii="Courier New" w:hAnsi="Courier New" w:eastAsia="Courier New"/>
           <w:sz w:val="19"/>
         </w:rPr>
         <w:t>|   |-- LoginRequest.java</w:t>
@@ -4919,7 +4919,7 @@
       </w:r>
       <w:r>
         <w:rPr>
-          <w:rFonts w:ascii="Consolas" w:hAnsi="Consolas" w:eastAsia="Consolas"/>
+          <w:rFonts w:ascii="Courier New" w:hAnsi="Courier New" w:eastAsia="Courier New"/>
           <w:sz w:val="19"/>
         </w:rPr>
         <w:t>|   `-- AuthResponse.java  ...</w:t>
@@ -4927,7 +4927,7 @@
       </w:r>
       <w:r>
         <w:rPr>
-          <w:rFonts w:ascii="Consolas" w:hAnsi="Consolas" w:eastAsia="Consolas"/>
+          <w:rFonts w:ascii="Courier New" w:hAnsi="Courier New" w:eastAsia="Courier New"/>
           <w:sz w:val="19"/>
         </w:rPr>
         <w:t>|-- security/</w:t>
@@ -4935,7 +4935,7 @@
       </w:r>
       <w:r>
         <w:rPr>
-          <w:rFonts w:ascii="Consolas" w:hAnsi="Consolas" w:eastAsia="Consolas"/>
+          <w:rFonts w:ascii="Courier New" w:hAnsi="Courier New" w:eastAsia="Courier New"/>
           <w:sz w:val="19"/>
         </w:rPr>
         <w:t>|   |-- JwtService.java            tao va doc token</w:t>
@@ -4943,7 +4943,7 @@
       </w:r>
       <w:r>
         <w:rPr>
-          <w:rFonts w:ascii="Consolas" w:hAnsi="Consolas" w:eastAsia="Consolas"/>
+          <w:rFonts w:ascii="Courier New" w:hAnsi="Courier New" w:eastAsia="Courier New"/>
           <w:sz w:val="19"/>
         </w:rPr>
         <w:t>|   |-- JwtAuthenticationFilter.java   doc header Authorization</w:t>
@@ -4951,7 +4951,7 @@
       </w:r>
       <w:r>
         <w:rPr>
-          <w:rFonts w:ascii="Consolas" w:hAnsi="Consolas" w:eastAsia="Consolas"/>
+          <w:rFonts w:ascii="Courier New" w:hAnsi="Courier New" w:eastAsia="Courier New"/>
           <w:sz w:val="19"/>
         </w:rPr>
         <w:t>|   `-- AuthPrincipal.java         thong tin nguoi dang nhap</w:t>
@@ -4959,7 +4959,7 @@
       </w:r>
       <w:r>
         <w:rPr>
-          <w:rFonts w:ascii="Consolas" w:hAnsi="Consolas" w:eastAsia="Consolas"/>
+          <w:rFonts w:ascii="Courier New" w:hAnsi="Courier New" w:eastAsia="Courier New"/>
           <w:sz w:val="19"/>
         </w:rPr>
         <w:t>|-- config/SecurityConfig.java     cau hinh bao mat</w:t>
@@ -4967,7 +4967,7 @@
       </w:r>
       <w:r>
         <w:rPr>
-          <w:rFonts w:ascii="Consolas" w:hAnsi="Consolas" w:eastAsia="Consolas"/>
+          <w:rFonts w:ascii="Courier New" w:hAnsi="Courier New" w:eastAsia="Courier New"/>
           <w:sz w:val="19"/>
         </w:rPr>
         <w:t>`-- web/GlobalExceptionHandler.java    xu ly loi tra ve</w:t>
@@ -5040,7 +5040,7 @@
       </w:r>
       <w:r>
         <w:rPr>
-          <w:rFonts w:ascii="Consolas" w:hAnsi="Consolas" w:eastAsia="Consolas"/>
+          <w:rFonts w:ascii="Courier New" w:hAnsi="Courier New" w:eastAsia="Courier New"/>
           <w:b w:val="0"/>
           <w:i w:val="0"/>
           <w:sz w:val="21"/>
@@ -5151,19 +5151,19 @@
     </w:p>
     <w:p>
       <w:pPr>
-        <w:spacing w:before="120" w:after="120" w:line="264" w:lineRule="auto"/>
-        <w:ind w:left="170"/>
-        <w:shd w:val="clear" w:fill="F4F4F4"/>
         <w:pBdr>
           <w:top w:val="single" w:sz="6" w:space="4" w:color="C9C9C9"/>
           <w:left w:val="single" w:sz="6" w:space="4" w:color="C9C9C9"/>
           <w:bottom w:val="single" w:sz="6" w:space="4" w:color="C9C9C9"/>
           <w:right w:val="single" w:sz="6" w:space="4" w:color="C9C9C9"/>
         </w:pBdr>
-      </w:pPr>
-      <w:r>
-        <w:rPr>
-          <w:rFonts w:ascii="Consolas" w:hAnsi="Consolas" w:eastAsia="Consolas"/>
+        <w:shd w:val="clear" w:fill="F4F4F4"/>
+        <w:spacing w:before="120" w:after="120" w:line="264" w:lineRule="auto"/>
+        <w:ind w:left="170"/>
+      </w:pPr>
+      <w:r>
+        <w:rPr>
+          <w:rFonts w:ascii="Courier New" w:hAnsi="Courier New" w:eastAsia="Courier New"/>
           <w:sz w:val="19"/>
         </w:rPr>
         <w:t>OrderController.checkout()         nhan request, kiem tra la nguoi mua</w:t>
@@ -5171,7 +5171,7 @@
       </w:r>
       <w:r>
         <w:rPr>
-          <w:rFonts w:ascii="Consolas" w:hAnsi="Consolas" w:eastAsia="Consolas"/>
+          <w:rFonts w:ascii="Courier New" w:hAnsi="Courier New" w:eastAsia="Courier New"/>
           <w:sz w:val="19"/>
         </w:rPr>
         <w:t xml:space="preserve">  -&gt; OrderService.checkout()       doc gio hang tu Redis</w:t>
@@ -5179,7 +5179,7 @@
       </w:r>
       <w:r>
         <w:rPr>
-          <w:rFonts w:ascii="Consolas" w:hAnsi="Consolas" w:eastAsia="Consolas"/>
+          <w:rFonts w:ascii="Courier New" w:hAnsi="Courier New" w:eastAsia="Courier New"/>
           <w:sz w:val="19"/>
         </w:rPr>
         <w:t xml:space="preserve">       -&gt; ProductClient.reserve()  goi product-service tru kho</w:t>
@@ -5187,7 +5187,7 @@
       </w:r>
       <w:r>
         <w:rPr>
-          <w:rFonts w:ascii="Consolas" w:hAnsi="Consolas" w:eastAsia="Consolas"/>
+          <w:rFonts w:ascii="Courier New" w:hAnsi="Courier New" w:eastAsia="Courier New"/>
           <w:sz w:val="19"/>
         </w:rPr>
         <w:t xml:space="preserve">       -&gt; CustomerOrder.addItem()  cong don tien vao don hang</w:t>
@@ -5195,7 +5195,7 @@
       </w:r>
       <w:r>
         <w:rPr>
-          <w:rFonts w:ascii="Consolas" w:hAnsi="Consolas" w:eastAsia="Consolas"/>
+          <w:rFonts w:ascii="Courier New" w:hAnsi="Courier New" w:eastAsia="Courier New"/>
           <w:sz w:val="19"/>
         </w:rPr>
         <w:t xml:space="preserve">       -&gt; applyVoucher()           ap ma giam gia neu co</w:t>
@@ -5203,7 +5203,7 @@
       </w:r>
       <w:r>
         <w:rPr>
-          <w:rFonts w:ascii="Consolas" w:hAnsi="Consolas" w:eastAsia="Consolas"/>
+          <w:rFonts w:ascii="Courier New" w:hAnsi="Courier New" w:eastAsia="Courier New"/>
           <w:sz w:val="19"/>
         </w:rPr>
         <w:t xml:space="preserve">       -&gt; orderRepository.save()   luu don vao MySQL</w:t>
@@ -5211,7 +5211,7 @@
       </w:r>
       <w:r>
         <w:rPr>
-          <w:rFonts w:ascii="Consolas" w:hAnsi="Consolas" w:eastAsia="Consolas"/>
+          <w:rFonts w:ascii="Courier New" w:hAnsi="Courier New" w:eastAsia="Courier New"/>
           <w:sz w:val="19"/>
         </w:rPr>
         <w:t xml:space="preserve">       -&gt; cartService.clearCart()  xoa gio hang</w:t>
@@ -5219,7 +5219,7 @@
       </w:r>
       <w:r>
         <w:rPr>
-          <w:rFonts w:ascii="Consolas" w:hAnsi="Consolas" w:eastAsia="Consolas"/>
+          <w:rFonts w:ascii="Courier New" w:hAnsi="Courier New" w:eastAsia="Courier New"/>
           <w:sz w:val="19"/>
         </w:rPr>
         <w:t xml:space="preserve">  &lt;- tra ve thong tin don hang cho frontend</w:t>
@@ -5247,7 +5247,7 @@
       </w:r>
       <w:r>
         <w:rPr>
-          <w:rFonts w:ascii="Consolas" w:hAnsi="Consolas" w:eastAsia="Consolas"/>
+          <w:rFonts w:ascii="Courier New" w:hAnsi="Courier New" w:eastAsia="Courier New"/>
           <w:b w:val="0"/>
           <w:i w:val="0"/>
           <w:sz w:val="21"/>
@@ -5265,19 +5265,19 @@
     </w:p>
     <w:p>
       <w:pPr>
-        <w:spacing w:before="120" w:after="120" w:line="264" w:lineRule="auto"/>
-        <w:ind w:left="170"/>
-        <w:shd w:val="clear" w:fill="F4F4F4"/>
         <w:pBdr>
           <w:top w:val="single" w:sz="6" w:space="4" w:color="C9C9C9"/>
           <w:left w:val="single" w:sz="6" w:space="4" w:color="C9C9C9"/>
           <w:bottom w:val="single" w:sz="6" w:space="4" w:color="C9C9C9"/>
           <w:right w:val="single" w:sz="6" w:space="4" w:color="C9C9C9"/>
         </w:pBdr>
-      </w:pPr>
-      <w:r>
-        <w:rPr>
-          <w:rFonts w:ascii="Consolas" w:hAnsi="Consolas" w:eastAsia="Consolas"/>
+        <w:shd w:val="clear" w:fill="F4F4F4"/>
+        <w:spacing w:before="120" w:after="120" w:line="264" w:lineRule="auto"/>
+        <w:ind w:left="170"/>
+      </w:pPr>
+      <w:r>
+        <w:rPr>
+          <w:rFonts w:ascii="Courier New" w:hAnsi="Courier New" w:eastAsia="Courier New"/>
           <w:sz w:val="19"/>
         </w:rPr>
         <w:t>frontend/src/app/</w:t>
@@ -5285,7 +5285,7 @@
       </w:r>
       <w:r>
         <w:rPr>
-          <w:rFonts w:ascii="Consolas" w:hAnsi="Consolas" w:eastAsia="Consolas"/>
+          <w:rFonts w:ascii="Courier New" w:hAnsi="Courier New" w:eastAsia="Courier New"/>
           <w:sz w:val="19"/>
         </w:rPr>
         <w:t>|-- page.tsx                     /              trang chu</w:t>
@@ -5293,7 +5293,7 @@
       </w:r>
       <w:r>
         <w:rPr>
-          <w:rFonts w:ascii="Consolas" w:hAnsi="Consolas" w:eastAsia="Consolas"/>
+          <w:rFonts w:ascii="Courier New" w:hAnsi="Courier New" w:eastAsia="Courier New"/>
           <w:sz w:val="19"/>
         </w:rPr>
         <w:t>|-- login/page.tsx               /login         dang nhap, dang ky</w:t>
@@ -5301,7 +5301,7 @@
       </w:r>
       <w:r>
         <w:rPr>
-          <w:rFonts w:ascii="Consolas" w:hAnsi="Consolas" w:eastAsia="Consolas"/>
+          <w:rFonts w:ascii="Courier New" w:hAnsi="Courier New" w:eastAsia="Courier New"/>
           <w:sz w:val="19"/>
         </w:rPr>
         <w:t>|-- products/[productId]/page.tsx  /products/1  chi tiet san pham</w:t>
@@ -5309,7 +5309,7 @@
       </w:r>
       <w:r>
         <w:rPr>
-          <w:rFonts w:ascii="Consolas" w:hAnsi="Consolas" w:eastAsia="Consolas"/>
+          <w:rFonts w:ascii="Courier New" w:hAnsi="Courier New" w:eastAsia="Courier New"/>
           <w:sz w:val="19"/>
         </w:rPr>
         <w:t>|-- cart/page.tsx                /cart          gio hang</w:t>
@@ -5317,7 +5317,7 @@
       </w:r>
       <w:r>
         <w:rPr>
-          <w:rFonts w:ascii="Consolas" w:hAnsi="Consolas" w:eastAsia="Consolas"/>
+          <w:rFonts w:ascii="Courier New" w:hAnsi="Courier New" w:eastAsia="Courier New"/>
           <w:sz w:val="19"/>
         </w:rPr>
         <w:t>|-- orders/page.tsx              /orders        don hang cua toi</w:t>
@@ -5325,7 +5325,7 @@
       </w:r>
       <w:r>
         <w:rPr>
-          <w:rFonts w:ascii="Consolas" w:hAnsi="Consolas" w:eastAsia="Consolas"/>
+          <w:rFonts w:ascii="Courier New" w:hAnsi="Courier New" w:eastAsia="Courier New"/>
           <w:sz w:val="19"/>
         </w:rPr>
         <w:t>|-- account/page.tsx             /account       thong tin ca nhan</w:t>
@@ -5333,7 +5333,7 @@
       </w:r>
       <w:r>
         <w:rPr>
-          <w:rFonts w:ascii="Consolas" w:hAnsi="Consolas" w:eastAsia="Consolas"/>
+          <w:rFonts w:ascii="Courier New" w:hAnsi="Courier New" w:eastAsia="Courier New"/>
           <w:sz w:val="19"/>
         </w:rPr>
         <w:t>|-- seller/page.tsx              /seller        kenh nguoi ban</w:t>
@@ -5341,7 +5341,7 @@
       </w:r>
       <w:r>
         <w:rPr>
-          <w:rFonts w:ascii="Consolas" w:hAnsi="Consolas" w:eastAsia="Consolas"/>
+          <w:rFonts w:ascii="Courier New" w:hAnsi="Courier New" w:eastAsia="Courier New"/>
           <w:sz w:val="19"/>
         </w:rPr>
         <w:t>|-- admin/page.tsx               /admin         khu quan tri</w:t>
@@ -5349,7 +5349,7 @@
       </w:r>
       <w:r>
         <w:rPr>
-          <w:rFonts w:ascii="Consolas" w:hAnsi="Consolas" w:eastAsia="Consolas"/>
+          <w:rFonts w:ascii="Courier New" w:hAnsi="Courier New" w:eastAsia="Courier New"/>
           <w:sz w:val="19"/>
         </w:rPr>
         <w:t>|-- layout.tsx                   khung chung cho moi trang</w:t>
@@ -5357,7 +5357,7 @@
       </w:r>
       <w:r>
         <w:rPr>
-          <w:rFonts w:ascii="Consolas" w:hAnsi="Consolas" w:eastAsia="Consolas"/>
+          <w:rFonts w:ascii="Courier New" w:hAnsi="Courier New" w:eastAsia="Courier New"/>
           <w:sz w:val="19"/>
         </w:rPr>
         <w:t>|-- components/</w:t>
@@ -5365,7 +5365,7 @@
       </w:r>
       <w:r>
         <w:rPr>
-          <w:rFonts w:ascii="Consolas" w:hAnsi="Consolas" w:eastAsia="Consolas"/>
+          <w:rFonts w:ascii="Courier New" w:hAnsi="Courier New" w:eastAsia="Courier New"/>
           <w:sz w:val="19"/>
         </w:rPr>
         <w:t>|   |-- Header.tsx               thanh dieu huong, gio hang</w:t>
@@ -5373,7 +5373,7 @@
       </w:r>
       <w:r>
         <w:rPr>
-          <w:rFonts w:ascii="Consolas" w:hAnsi="Consolas" w:eastAsia="Consolas"/>
+          <w:rFonts w:ascii="Courier New" w:hAnsi="Courier New" w:eastAsia="Courier New"/>
           <w:sz w:val="19"/>
         </w:rPr>
         <w:t>|   |-- ui.tsx                   cac component dung chung (Button, Card...)</w:t>
@@ -5381,7 +5381,7 @@
       </w:r>
       <w:r>
         <w:rPr>
-          <w:rFonts w:ascii="Consolas" w:hAnsi="Consolas" w:eastAsia="Consolas"/>
+          <w:rFonts w:ascii="Courier New" w:hAnsi="Courier New" w:eastAsia="Courier New"/>
           <w:sz w:val="19"/>
         </w:rPr>
         <w:t>|   |-- buyer/                   component cho nguoi mua</w:t>
@@ -5389,7 +5389,7 @@
       </w:r>
       <w:r>
         <w:rPr>
-          <w:rFonts w:ascii="Consolas" w:hAnsi="Consolas" w:eastAsia="Consolas"/>
+          <w:rFonts w:ascii="Courier New" w:hAnsi="Courier New" w:eastAsia="Courier New"/>
           <w:sz w:val="19"/>
         </w:rPr>
         <w:t>|   |-- seller/                  component cho nguoi ban</w:t>
@@ -5397,7 +5397,7 @@
       </w:r>
       <w:r>
         <w:rPr>
-          <w:rFonts w:ascii="Consolas" w:hAnsi="Consolas" w:eastAsia="Consolas"/>
+          <w:rFonts w:ascii="Courier New" w:hAnsi="Courier New" w:eastAsia="Courier New"/>
           <w:sz w:val="19"/>
         </w:rPr>
         <w:t>|   `-- admin/                   component cho quan tri vien</w:t>
@@ -5405,7 +5405,7 @@
       </w:r>
       <w:r>
         <w:rPr>
-          <w:rFonts w:ascii="Consolas" w:hAnsi="Consolas" w:eastAsia="Consolas"/>
+          <w:rFonts w:ascii="Courier New" w:hAnsi="Courier New" w:eastAsia="Courier New"/>
           <w:sz w:val="19"/>
         </w:rPr>
         <w:t>`-- lib/</w:t>
@@ -5413,7 +5413,7 @@
       </w:r>
       <w:r>
         <w:rPr>
-          <w:rFonts w:ascii="Consolas" w:hAnsi="Consolas" w:eastAsia="Consolas"/>
+          <w:rFonts w:ascii="Courier New" w:hAnsi="Courier New" w:eastAsia="Courier New"/>
           <w:sz w:val="19"/>
         </w:rPr>
         <w:t xml:space="preserve">    |-- api.ts                   goi API, tu gan token</w:t>
@@ -5421,7 +5421,7 @@
       </w:r>
       <w:r>
         <w:rPr>
-          <w:rFonts w:ascii="Consolas" w:hAnsi="Consolas" w:eastAsia="Consolas"/>
+          <w:rFonts w:ascii="Courier New" w:hAnsi="Courier New" w:eastAsia="Courier New"/>
           <w:sz w:val="19"/>
         </w:rPr>
         <w:t xml:space="preserve">    |-- types.ts                 khai bao kieu du lieu</w:t>
@@ -5429,7 +5429,7 @@
       </w:r>
       <w:r>
         <w:rPr>
-          <w:rFonts w:ascii="Consolas" w:hAnsi="Consolas" w:eastAsia="Consolas"/>
+          <w:rFonts w:ascii="Courier New" w:hAnsi="Courier New" w:eastAsia="Courier New"/>
           <w:sz w:val="19"/>
         </w:rPr>
         <w:t xml:space="preserve">    |-- session.ts               luu phien dang nhap</w:t>
@@ -5437,7 +5437,7 @@
       </w:r>
       <w:r>
         <w:rPr>
-          <w:rFonts w:ascii="Consolas" w:hAnsi="Consolas" w:eastAsia="Consolas"/>
+          <w:rFonts w:ascii="Courier New" w:hAnsi="Courier New" w:eastAsia="Courier New"/>
           <w:sz w:val="19"/>
         </w:rPr>
         <w:t xml:space="preserve">    |-- cart.tsx                 gio hang dung chung</w:t>
@@ -5445,7 +5445,7 @@
       </w:r>
       <w:r>
         <w:rPr>
-          <w:rFonts w:ascii="Consolas" w:hAnsi="Consolas" w:eastAsia="Consolas"/>
+          <w:rFonts w:ascii="Courier New" w:hAnsi="Courier New" w:eastAsia="Courier New"/>
           <w:sz w:val="19"/>
         </w:rPr>
         <w:t xml:space="preserve">    `-- order.ts, payment.ts     nhan trang thai don, phuong thuc thanh toan</w:t>
@@ -5478,7 +5478,7 @@
       </w:r>
       <w:r>
         <w:rPr>
-          <w:rFonts w:ascii="Consolas" w:hAnsi="Consolas" w:eastAsia="Consolas"/>
+          <w:rFonts w:ascii="Courier New" w:hAnsi="Courier New" w:eastAsia="Courier New"/>
           <w:b w:val="0"/>
           <w:i w:val="0"/>
           <w:sz w:val="21"/>
@@ -5495,7 +5495,7 @@
       </w:r>
       <w:r>
         <w:rPr>
-          <w:rFonts w:ascii="Consolas" w:hAnsi="Consolas" w:eastAsia="Consolas"/>
+          <w:rFonts w:ascii="Courier New" w:hAnsi="Courier New" w:eastAsia="Courier New"/>
           <w:b w:val="0"/>
           <w:i w:val="0"/>
           <w:sz w:val="21"/>
@@ -5512,7 +5512,7 @@
       </w:r>
       <w:r>
         <w:rPr>
-          <w:rFonts w:ascii="Consolas" w:hAnsi="Consolas" w:eastAsia="Consolas"/>
+          <w:rFonts w:ascii="Courier New" w:hAnsi="Courier New" w:eastAsia="Courier New"/>
           <w:b w:val="0"/>
           <w:i w:val="0"/>
           <w:sz w:val="21"/>
@@ -5595,8 +5595,8 @@
           </w:tcPr>
           <w:p>
             <w:pPr>
+              <w:shd w:val="clear" w:fill="DCEDEA"/>
               <w:spacing w:after="40"/>
-              <w:shd w:val="clear" w:fill="DCEDEA"/>
             </w:pPr>
             <w:r/>
             <w:r>
@@ -5614,8 +5614,8 @@
           </w:tcPr>
           <w:p>
             <w:pPr>
+              <w:shd w:val="clear" w:fill="DCEDEA"/>
               <w:spacing w:after="40"/>
-              <w:shd w:val="clear" w:fill="DCEDEA"/>
             </w:pPr>
             <w:r/>
             <w:r>
@@ -5633,8 +5633,8 @@
           </w:tcPr>
           <w:p>
             <w:pPr>
+              <w:shd w:val="clear" w:fill="DCEDEA"/>
               <w:spacing w:after="40"/>
-              <w:shd w:val="clear" w:fill="DCEDEA"/>
             </w:pPr>
             <w:r/>
             <w:r>
@@ -5652,8 +5652,8 @@
           </w:tcPr>
           <w:p>
             <w:pPr>
+              <w:shd w:val="clear" w:fill="DCEDEA"/>
               <w:spacing w:after="40"/>
-              <w:shd w:val="clear" w:fill="DCEDEA"/>
             </w:pPr>
             <w:r/>
             <w:r>
@@ -6106,7 +6106,7 @@
       </w:r>
       <w:r>
         <w:rPr>
-          <w:rFonts w:ascii="Consolas" w:hAnsi="Consolas" w:eastAsia="Consolas"/>
+          <w:rFonts w:ascii="Courier New" w:hAnsi="Courier New" w:eastAsia="Courier New"/>
           <w:b w:val="0"/>
           <w:i w:val="0"/>
           <w:sz w:val="21"/>
@@ -6123,7 +6123,7 @@
       </w:r>
       <w:r>
         <w:rPr>
-          <w:rFonts w:ascii="Consolas" w:hAnsi="Consolas" w:eastAsia="Consolas"/>
+          <w:rFonts w:ascii="Courier New" w:hAnsi="Courier New" w:eastAsia="Courier New"/>
           <w:b w:val="0"/>
           <w:i w:val="0"/>
           <w:sz w:val="21"/>
@@ -6140,7 +6140,7 @@
       </w:r>
       <w:r>
         <w:rPr>
-          <w:rFonts w:ascii="Consolas" w:hAnsi="Consolas" w:eastAsia="Consolas"/>
+          <w:rFonts w:ascii="Courier New" w:hAnsi="Courier New" w:eastAsia="Courier New"/>
           <w:b w:val="0"/>
           <w:i w:val="0"/>
           <w:sz w:val="21"/>
@@ -6178,7 +6178,7 @@
       </w:r>
       <w:r>
         <w:rPr>
-          <w:rFonts w:ascii="Consolas" w:hAnsi="Consolas" w:eastAsia="Consolas"/>
+          <w:rFonts w:ascii="Courier New" w:hAnsi="Courier New" w:eastAsia="Courier New"/>
           <w:b w:val="0"/>
           <w:i w:val="0"/>
           <w:sz w:val="21"/>
@@ -6195,7 +6195,7 @@
       </w:r>
       <w:r>
         <w:rPr>
-          <w:rFonts w:ascii="Consolas" w:hAnsi="Consolas" w:eastAsia="Consolas"/>
+          <w:rFonts w:ascii="Courier New" w:hAnsi="Courier New" w:eastAsia="Courier New"/>
           <w:b w:val="0"/>
           <w:i w:val="0"/>
           <w:sz w:val="21"/>
@@ -6225,7 +6225,7 @@
       </w:r>
       <w:r>
         <w:rPr>
-          <w:rFonts w:ascii="Consolas" w:hAnsi="Consolas" w:eastAsia="Consolas"/>
+          <w:rFonts w:ascii="Courier New" w:hAnsi="Courier New" w:eastAsia="Courier New"/>
           <w:b w:val="0"/>
           <w:i w:val="0"/>
           <w:sz w:val="21"/>
@@ -6242,7 +6242,7 @@
       </w:r>
       <w:r>
         <w:rPr>
-          <w:rFonts w:ascii="Consolas" w:hAnsi="Consolas" w:eastAsia="Consolas"/>
+          <w:rFonts w:ascii="Courier New" w:hAnsi="Courier New" w:eastAsia="Courier New"/>
           <w:b w:val="0"/>
           <w:i w:val="0"/>
           <w:sz w:val="21"/>
@@ -6272,7 +6272,7 @@
       </w:r>
       <w:r>
         <w:rPr>
-          <w:rFonts w:ascii="Consolas" w:hAnsi="Consolas" w:eastAsia="Consolas"/>
+          <w:rFonts w:ascii="Courier New" w:hAnsi="Courier New" w:eastAsia="Courier New"/>
           <w:b w:val="0"/>
           <w:i w:val="0"/>
           <w:sz w:val="21"/>
@@ -6289,7 +6289,7 @@
       </w:r>
       <w:r>
         <w:rPr>
-          <w:rFonts w:ascii="Consolas" w:hAnsi="Consolas" w:eastAsia="Consolas"/>
+          <w:rFonts w:ascii="Courier New" w:hAnsi="Courier New" w:eastAsia="Courier New"/>
           <w:b w:val="0"/>
           <w:i w:val="0"/>
           <w:sz w:val="21"/>
@@ -6319,7 +6319,7 @@
       </w:r>
       <w:r>
         <w:rPr>
-          <w:rFonts w:ascii="Consolas" w:hAnsi="Consolas" w:eastAsia="Consolas"/>
+          <w:rFonts w:ascii="Courier New" w:hAnsi="Courier New" w:eastAsia="Courier New"/>
           <w:b w:val="0"/>
           <w:i w:val="0"/>
           <w:sz w:val="21"/>
@@ -6349,7 +6349,7 @@
       </w:r>
       <w:r>
         <w:rPr>
-          <w:rFonts w:ascii="Consolas" w:hAnsi="Consolas" w:eastAsia="Consolas"/>
+          <w:rFonts w:ascii="Courier New" w:hAnsi="Courier New" w:eastAsia="Courier New"/>
           <w:b w:val="0"/>
           <w:i w:val="0"/>
           <w:sz w:val="21"/>
@@ -6388,19 +6388,19 @@
     </w:p>
     <w:p>
       <w:pPr>
-        <w:spacing w:before="120" w:after="120" w:line="264" w:lineRule="auto"/>
-        <w:ind w:left="170"/>
-        <w:shd w:val="clear" w:fill="F4F4F4"/>
         <w:pBdr>
           <w:top w:val="single" w:sz="6" w:space="4" w:color="C9C9C9"/>
           <w:left w:val="single" w:sz="6" w:space="4" w:color="C9C9C9"/>
           <w:bottom w:val="single" w:sz="6" w:space="4" w:color="C9C9C9"/>
           <w:right w:val="single" w:sz="6" w:space="4" w:color="C9C9C9"/>
         </w:pBdr>
-      </w:pPr>
-      <w:r>
-        <w:rPr>
-          <w:rFonts w:ascii="Consolas" w:hAnsi="Consolas" w:eastAsia="Consolas"/>
+        <w:shd w:val="clear" w:fill="F4F4F4"/>
+        <w:spacing w:before="120" w:after="120" w:line="264" w:lineRule="auto"/>
+        <w:ind w:left="170"/>
+      </w:pPr>
+      <w:r>
+        <w:rPr>
+          <w:rFonts w:ascii="Courier New" w:hAnsi="Courier New" w:eastAsia="Courier New"/>
           <w:sz w:val="19"/>
         </w:rPr>
         <w:t>PENDING --&gt; CONFIRMED --&gt; PACKING --&gt; SHIPPING --&gt; DELIVERED</w:t>
@@ -6408,7 +6408,7 @@
       </w:r>
       <w:r>
         <w:rPr>
-          <w:rFonts w:ascii="Consolas" w:hAnsi="Consolas" w:eastAsia="Consolas"/>
+          <w:rFonts w:ascii="Courier New" w:hAnsi="Courier New" w:eastAsia="Courier New"/>
           <w:sz w:val="19"/>
         </w:rPr>
         <w:t>(cho xac nhan) (da xac nhan) (dong goi) (dang giao) (da nhan hang)</w:t>
@@ -6416,7 +6416,7 @@
       </w:r>
       <w:r>
         <w:rPr>
-          <w:rFonts w:ascii="Consolas" w:hAnsi="Consolas" w:eastAsia="Consolas"/>
+          <w:rFonts w:ascii="Courier New" w:hAnsi="Courier New" w:eastAsia="Courier New"/>
           <w:sz w:val="19"/>
         </w:rPr>
         <w:t xml:space="preserve">   |            |            |</w:t>
@@ -6424,7 +6424,7 @@
       </w:r>
       <w:r>
         <w:rPr>
-          <w:rFonts w:ascii="Consolas" w:hAnsi="Consolas" w:eastAsia="Consolas"/>
+          <w:rFonts w:ascii="Courier New" w:hAnsi="Courier New" w:eastAsia="Courier New"/>
           <w:sz w:val="19"/>
         </w:rPr>
         <w:t xml:space="preserve">   v            v            v</w:t>
@@ -6432,7 +6432,7 @@
       </w:r>
       <w:r>
         <w:rPr>
-          <w:rFonts w:ascii="Consolas" w:hAnsi="Consolas" w:eastAsia="Consolas"/>
+          <w:rFonts w:ascii="Courier New" w:hAnsi="Courier New" w:eastAsia="Courier New"/>
           <w:sz w:val="19"/>
         </w:rPr>
         <w:t xml:space="preserve">       CANCELLED (da huy)              tu SHIPPING tro di khong huy duoc</w:t>
@@ -6535,8 +6535,8 @@
           </w:tcPr>
           <w:p>
             <w:pPr>
+              <w:shd w:val="clear" w:fill="DCEDEA"/>
               <w:spacing w:after="40"/>
-              <w:shd w:val="clear" w:fill="DCEDEA"/>
             </w:pPr>
             <w:r/>
             <w:r>
@@ -6554,8 +6554,8 @@
           </w:tcPr>
           <w:p>
             <w:pPr>
+              <w:shd w:val="clear" w:fill="DCEDEA"/>
               <w:spacing w:after="40"/>
-              <w:shd w:val="clear" w:fill="DCEDEA"/>
             </w:pPr>
             <w:r/>
             <w:r>
@@ -6573,8 +6573,8 @@
           </w:tcPr>
           <w:p>
             <w:pPr>
+              <w:shd w:val="clear" w:fill="DCEDEA"/>
               <w:spacing w:after="40"/>
-              <w:shd w:val="clear" w:fill="DCEDEA"/>
             </w:pPr>
             <w:r/>
             <w:r>
@@ -6766,7 +6766,7 @@
       </w:r>
       <w:r>
         <w:rPr>
-          <w:rFonts w:ascii="Consolas" w:hAnsi="Consolas" w:eastAsia="Consolas"/>
+          <w:rFonts w:ascii="Courier New" w:hAnsi="Courier New" w:eastAsia="Courier New"/>
           <w:b w:val="0"/>
           <w:i w:val="0"/>
           <w:sz w:val="21"/>
@@ -7023,8 +7023,8 @@
           </w:tcPr>
           <w:p>
             <w:pPr>
+              <w:shd w:val="clear" w:fill="DCEDEA"/>
               <w:spacing w:after="40"/>
-              <w:shd w:val="clear" w:fill="DCEDEA"/>
             </w:pPr>
             <w:r/>
             <w:r>
@@ -7042,8 +7042,8 @@
           </w:tcPr>
           <w:p>
             <w:pPr>
+              <w:shd w:val="clear" w:fill="DCEDEA"/>
               <w:spacing w:after="40"/>
-              <w:shd w:val="clear" w:fill="DCEDEA"/>
             </w:pPr>
             <w:r/>
             <w:r>
@@ -7061,8 +7061,8 @@
           </w:tcPr>
           <w:p>
             <w:pPr>
+              <w:shd w:val="clear" w:fill="DCEDEA"/>
               <w:spacing w:after="40"/>
-              <w:shd w:val="clear" w:fill="DCEDEA"/>
             </w:pPr>
             <w:r/>
             <w:r>
@@ -7321,19 +7321,19 @@
     </w:p>
     <w:p>
       <w:pPr>
-        <w:spacing w:before="120" w:after="120" w:line="264" w:lineRule="auto"/>
-        <w:ind w:left="170"/>
-        <w:shd w:val="clear" w:fill="F4F4F4"/>
         <w:pBdr>
           <w:top w:val="single" w:sz="6" w:space="4" w:color="C9C9C9"/>
           <w:left w:val="single" w:sz="6" w:space="4" w:color="C9C9C9"/>
           <w:bottom w:val="single" w:sz="6" w:space="4" w:color="C9C9C9"/>
           <w:right w:val="single" w:sz="6" w:space="4" w:color="C9C9C9"/>
         </w:pBdr>
-      </w:pPr>
-      <w:r>
-        <w:rPr>
-          <w:rFonts w:ascii="Consolas" w:hAnsi="Consolas" w:eastAsia="Consolas"/>
+        <w:shd w:val="clear" w:fill="F4F4F4"/>
+        <w:spacing w:before="120" w:after="120" w:line="264" w:lineRule="auto"/>
+        <w:ind w:left="170"/>
+      </w:pPr>
+      <w:r>
+        <w:rPr>
+          <w:rFonts w:ascii="Courier New" w:hAnsi="Courier New" w:eastAsia="Courier New"/>
           <w:sz w:val="19"/>
         </w:rPr>
         <w:t>java -version       # can 21 tro len</w:t>
@@ -7341,7 +7341,7 @@
       </w:r>
       <w:r>
         <w:rPr>
-          <w:rFonts w:ascii="Consolas" w:hAnsi="Consolas" w:eastAsia="Consolas"/>
+          <w:rFonts w:ascii="Courier New" w:hAnsi="Courier New" w:eastAsia="Courier New"/>
           <w:sz w:val="19"/>
         </w:rPr>
         <w:t>node -v             # can 20 tro len</w:t>
@@ -7349,7 +7349,7 @@
       </w:r>
       <w:r>
         <w:rPr>
-          <w:rFonts w:ascii="Consolas" w:hAnsi="Consolas" w:eastAsia="Consolas"/>
+          <w:rFonts w:ascii="Courier New" w:hAnsi="Courier New" w:eastAsia="Courier New"/>
           <w:sz w:val="19"/>
         </w:rPr>
         <w:t>docker info         # neu bao loi thi Docker Desktop chua bat</w:t>
@@ -7370,19 +7370,19 @@
     </w:p>
     <w:p>
       <w:pPr>
-        <w:spacing w:before="120" w:after="120" w:line="264" w:lineRule="auto"/>
-        <w:ind w:left="170"/>
-        <w:shd w:val="clear" w:fill="F4F4F4"/>
         <w:pBdr>
           <w:top w:val="single" w:sz="6" w:space="4" w:color="C9C9C9"/>
           <w:left w:val="single" w:sz="6" w:space="4" w:color="C9C9C9"/>
           <w:bottom w:val="single" w:sz="6" w:space="4" w:color="C9C9C9"/>
           <w:right w:val="single" w:sz="6" w:space="4" w:color="C9C9C9"/>
         </w:pBdr>
-      </w:pPr>
-      <w:r>
-        <w:rPr>
-          <w:rFonts w:ascii="Consolas" w:hAnsi="Consolas" w:eastAsia="Consolas"/>
+        <w:shd w:val="clear" w:fill="F4F4F4"/>
+        <w:spacing w:before="120" w:after="120" w:line="264" w:lineRule="auto"/>
+        <w:ind w:left="170"/>
+      </w:pPr>
+      <w:r>
+        <w:rPr>
+          <w:rFonts w:ascii="Courier New" w:hAnsi="Courier New" w:eastAsia="Courier New"/>
           <w:sz w:val="19"/>
         </w:rPr>
         <w:t>brew install openjdk@21</w:t>
@@ -7390,14 +7390,14 @@
       </w:r>
       <w:r>
         <w:rPr>
-          <w:rFonts w:ascii="Consolas" w:hAnsi="Consolas" w:eastAsia="Consolas"/>
+          <w:rFonts w:ascii="Courier New" w:hAnsi="Courier New" w:eastAsia="Courier New"/>
           <w:sz w:val="19"/>
         </w:rPr>
         <w:br/>
       </w:r>
       <w:r>
         <w:rPr>
-          <w:rFonts w:ascii="Consolas" w:hAnsi="Consolas" w:eastAsia="Consolas"/>
+          <w:rFonts w:ascii="Courier New" w:hAnsi="Courier New" w:eastAsia="Courier New"/>
           <w:sz w:val="19"/>
         </w:rPr>
         <w:t># neu may van mac dinh JDK cu, chi dinh JAVA_HOME truoc khi chay:</w:t>
@@ -7405,7 +7405,7 @@
       </w:r>
       <w:r>
         <w:rPr>
-          <w:rFonts w:ascii="Consolas" w:hAnsi="Consolas" w:eastAsia="Consolas"/>
+          <w:rFonts w:ascii="Courier New" w:hAnsi="Courier New" w:eastAsia="Courier New"/>
           <w:sz w:val="19"/>
         </w:rPr>
         <w:t>export JAVA_HOME=/opt/homebrew/opt/openjdk@21/libexec/openjdk.jdk/Contents/Home</w:t>
@@ -7425,7 +7425,7 @@
       </w:r>
       <w:r>
         <w:rPr>
-          <w:rFonts w:ascii="Consolas" w:hAnsi="Consolas" w:eastAsia="Consolas"/>
+          <w:rFonts w:ascii="Courier New" w:hAnsi="Courier New" w:eastAsia="Courier New"/>
           <w:b w:val="0"/>
           <w:i w:val="0"/>
           <w:sz w:val="21"/>
@@ -7442,7 +7442,7 @@
       </w:r>
       <w:r>
         <w:rPr>
-          <w:rFonts w:ascii="Consolas" w:hAnsi="Consolas" w:eastAsia="Consolas"/>
+          <w:rFonts w:ascii="Courier New" w:hAnsi="Courier New" w:eastAsia="Courier New"/>
           <w:b w:val="0"/>
           <w:i w:val="0"/>
           <w:sz w:val="21"/>
@@ -7459,7 +7459,7 @@
       </w:r>
       <w:r>
         <w:rPr>
-          <w:rFonts w:ascii="Consolas" w:hAnsi="Consolas" w:eastAsia="Consolas"/>
+          <w:rFonts w:ascii="Courier New" w:hAnsi="Courier New" w:eastAsia="Courier New"/>
           <w:b w:val="0"/>
           <w:i w:val="0"/>
           <w:sz w:val="21"/>
@@ -7498,19 +7498,19 @@
     </w:p>
     <w:p>
       <w:pPr>
-        <w:spacing w:before="120" w:after="120" w:line="264" w:lineRule="auto"/>
-        <w:ind w:left="170"/>
-        <w:shd w:val="clear" w:fill="F4F4F4"/>
         <w:pBdr>
           <w:top w:val="single" w:sz="6" w:space="4" w:color="C9C9C9"/>
           <w:left w:val="single" w:sz="6" w:space="4" w:color="C9C9C9"/>
           <w:bottom w:val="single" w:sz="6" w:space="4" w:color="C9C9C9"/>
           <w:right w:val="single" w:sz="6" w:space="4" w:color="C9C9C9"/>
         </w:pBdr>
-      </w:pPr>
-      <w:r>
-        <w:rPr>
-          <w:rFonts w:ascii="Consolas" w:hAnsi="Consolas" w:eastAsia="Consolas"/>
+        <w:shd w:val="clear" w:fill="F4F4F4"/>
+        <w:spacing w:before="120" w:after="120" w:line="264" w:lineRule="auto"/>
+        <w:ind w:left="170"/>
+      </w:pPr>
+      <w:r>
+        <w:rPr>
+          <w:rFonts w:ascii="Courier New" w:hAnsi="Courier New" w:eastAsia="Courier New"/>
           <w:sz w:val="19"/>
         </w:rPr>
         <w:t>docker compose -f infra/docker-compose.dev.yml up -d</w:t>
@@ -7531,19 +7531,19 @@
     </w:p>
     <w:p>
       <w:pPr>
-        <w:spacing w:before="120" w:after="120" w:line="264" w:lineRule="auto"/>
-        <w:ind w:left="170"/>
-        <w:shd w:val="clear" w:fill="F4F4F4"/>
         <w:pBdr>
           <w:top w:val="single" w:sz="6" w:space="4" w:color="C9C9C9"/>
           <w:left w:val="single" w:sz="6" w:space="4" w:color="C9C9C9"/>
           <w:bottom w:val="single" w:sz="6" w:space="4" w:color="C9C9C9"/>
           <w:right w:val="single" w:sz="6" w:space="4" w:color="C9C9C9"/>
         </w:pBdr>
-      </w:pPr>
-      <w:r>
-        <w:rPr>
-          <w:rFonts w:ascii="Consolas" w:hAnsi="Consolas" w:eastAsia="Consolas"/>
+        <w:shd w:val="clear" w:fill="F4F4F4"/>
+        <w:spacing w:before="120" w:after="120" w:line="264" w:lineRule="auto"/>
+        <w:ind w:left="170"/>
+      </w:pPr>
+      <w:r>
+        <w:rPr>
+          <w:rFonts w:ascii="Courier New" w:hAnsi="Courier New" w:eastAsia="Courier New"/>
           <w:sz w:val="19"/>
         </w:rPr>
         <w:t>docker compose -f infra/docker-compose.dev.yml ps</w:t>
@@ -7551,14 +7551,14 @@
       </w:r>
       <w:r>
         <w:rPr>
-          <w:rFonts w:ascii="Consolas" w:hAnsi="Consolas" w:eastAsia="Consolas"/>
+          <w:rFonts w:ascii="Courier New" w:hAnsi="Courier New" w:eastAsia="Courier New"/>
           <w:sz w:val="19"/>
         </w:rPr>
         <w:br/>
       </w:r>
       <w:r>
         <w:rPr>
-          <w:rFonts w:ascii="Consolas" w:hAnsi="Consolas" w:eastAsia="Consolas"/>
+          <w:rFonts w:ascii="Courier New" w:hAnsi="Courier New" w:eastAsia="Courier New"/>
           <w:sz w:val="19"/>
         </w:rPr>
         <w:t># ket qua mong doi: 6 container o trang thai Up</w:t>
@@ -7566,7 +7566,7 @@
       </w:r>
       <w:r>
         <w:rPr>
-          <w:rFonts w:ascii="Consolas" w:hAnsi="Consolas" w:eastAsia="Consolas"/>
+          <w:rFonts w:ascii="Courier New" w:hAnsi="Courier New" w:eastAsia="Courier New"/>
           <w:sz w:val="19"/>
         </w:rPr>
         <w:t>mysql-auth      Up   0.0.0.0:3310-&gt;3306/tcp</w:t>
@@ -7574,7 +7574,7 @@
       </w:r>
       <w:r>
         <w:rPr>
-          <w:rFonts w:ascii="Consolas" w:hAnsi="Consolas" w:eastAsia="Consolas"/>
+          <w:rFonts w:ascii="Courier New" w:hAnsi="Courier New" w:eastAsia="Courier New"/>
           <w:sz w:val="19"/>
         </w:rPr>
         <w:t>mysql-user      Up   0.0.0.0:3311-&gt;3306/tcp</w:t>
@@ -7582,7 +7582,7 @@
       </w:r>
       <w:r>
         <w:rPr>
-          <w:rFonts w:ascii="Consolas" w:hAnsi="Consolas" w:eastAsia="Consolas"/>
+          <w:rFonts w:ascii="Courier New" w:hAnsi="Courier New" w:eastAsia="Courier New"/>
           <w:sz w:val="19"/>
         </w:rPr>
         <w:t>mysql-product   Up   0.0.0.0:3312-&gt;3306/tcp</w:t>
@@ -7590,7 +7590,7 @@
       </w:r>
       <w:r>
         <w:rPr>
-          <w:rFonts w:ascii="Consolas" w:hAnsi="Consolas" w:eastAsia="Consolas"/>
+          <w:rFonts w:ascii="Courier New" w:hAnsi="Courier New" w:eastAsia="Courier New"/>
           <w:sz w:val="19"/>
         </w:rPr>
         <w:t>mysql-store     Up   0.0.0.0:3313-&gt;3306/tcp</w:t>
@@ -7598,7 +7598,7 @@
       </w:r>
       <w:r>
         <w:rPr>
-          <w:rFonts w:ascii="Consolas" w:hAnsi="Consolas" w:eastAsia="Consolas"/>
+          <w:rFonts w:ascii="Courier New" w:hAnsi="Courier New" w:eastAsia="Courier New"/>
           <w:sz w:val="19"/>
         </w:rPr>
         <w:t>mysql-order     Up   0.0.0.0:3314-&gt;3306/tcp</w:t>
@@ -7606,7 +7606,7 @@
       </w:r>
       <w:r>
         <w:rPr>
-          <w:rFonts w:ascii="Consolas" w:hAnsi="Consolas" w:eastAsia="Consolas"/>
+          <w:rFonts w:ascii="Courier New" w:hAnsi="Courier New" w:eastAsia="Courier New"/>
           <w:sz w:val="19"/>
         </w:rPr>
         <w:t>redis           Up   0.0.0.0:6379-&gt;6379/tcp</w:t>
@@ -7626,7 +7626,7 @@
       </w:r>
       <w:r>
         <w:rPr>
-          <w:rFonts w:ascii="Consolas" w:hAnsi="Consolas" w:eastAsia="Consolas"/>
+          <w:rFonts w:ascii="Courier New" w:hAnsi="Courier New" w:eastAsia="Courier New"/>
           <w:b w:val="0"/>
           <w:i w:val="0"/>
           <w:sz w:val="21"/>
@@ -7643,7 +7643,7 @@
       </w:r>
       <w:r>
         <w:rPr>
-          <w:rFonts w:ascii="Consolas" w:hAnsi="Consolas" w:eastAsia="Consolas"/>
+          <w:rFonts w:ascii="Courier New" w:hAnsi="Courier New" w:eastAsia="Courier New"/>
           <w:b w:val="0"/>
           <w:i w:val="0"/>
           <w:sz w:val="21"/>
@@ -7660,7 +7660,7 @@
       </w:r>
       <w:r>
         <w:rPr>
-          <w:rFonts w:ascii="Consolas" w:hAnsi="Consolas" w:eastAsia="Consolas"/>
+          <w:rFonts w:ascii="Courier New" w:hAnsi="Courier New" w:eastAsia="Courier New"/>
           <w:b w:val="0"/>
           <w:i w:val="0"/>
           <w:sz w:val="21"/>
@@ -7699,19 +7699,19 @@
     </w:p>
     <w:p>
       <w:pPr>
-        <w:spacing w:before="120" w:after="120" w:line="264" w:lineRule="auto"/>
-        <w:ind w:left="170"/>
-        <w:shd w:val="clear" w:fill="F4F4F4"/>
         <w:pBdr>
           <w:top w:val="single" w:sz="6" w:space="4" w:color="C9C9C9"/>
           <w:left w:val="single" w:sz="6" w:space="4" w:color="C9C9C9"/>
           <w:bottom w:val="single" w:sz="6" w:space="4" w:color="C9C9C9"/>
           <w:right w:val="single" w:sz="6" w:space="4" w:color="C9C9C9"/>
         </w:pBdr>
-      </w:pPr>
-      <w:r>
-        <w:rPr>
-          <w:rFonts w:ascii="Consolas" w:hAnsi="Consolas" w:eastAsia="Consolas"/>
+        <w:shd w:val="clear" w:fill="F4F4F4"/>
+        <w:spacing w:before="120" w:after="120" w:line="264" w:lineRule="auto"/>
+        <w:ind w:left="170"/>
+      </w:pPr>
+      <w:r>
+        <w:rPr>
+          <w:rFonts w:ascii="Courier New" w:hAnsi="Courier New" w:eastAsia="Courier New"/>
           <w:sz w:val="19"/>
         </w:rPr>
         <w:t>cd backend/auth-service    &amp;&amp; ./mvnw spring-boot:run     # cong 8081</w:t>
@@ -7719,7 +7719,7 @@
       </w:r>
       <w:r>
         <w:rPr>
-          <w:rFonts w:ascii="Consolas" w:hAnsi="Consolas" w:eastAsia="Consolas"/>
+          <w:rFonts w:ascii="Courier New" w:hAnsi="Courier New" w:eastAsia="Courier New"/>
           <w:sz w:val="19"/>
         </w:rPr>
         <w:t>cd backend/user-service    &amp;&amp; ./mvnw spring-boot:run     # cong 8082</w:t>
@@ -7727,7 +7727,7 @@
       </w:r>
       <w:r>
         <w:rPr>
-          <w:rFonts w:ascii="Consolas" w:hAnsi="Consolas" w:eastAsia="Consolas"/>
+          <w:rFonts w:ascii="Courier New" w:hAnsi="Courier New" w:eastAsia="Courier New"/>
           <w:sz w:val="19"/>
         </w:rPr>
         <w:t>cd backend/product-service &amp;&amp; ./mvnw spring-boot:run     # cong 8083</w:t>
@@ -7735,7 +7735,7 @@
       </w:r>
       <w:r>
         <w:rPr>
-          <w:rFonts w:ascii="Consolas" w:hAnsi="Consolas" w:eastAsia="Consolas"/>
+          <w:rFonts w:ascii="Courier New" w:hAnsi="Courier New" w:eastAsia="Courier New"/>
           <w:sz w:val="19"/>
         </w:rPr>
         <w:t>cd backend/store-service   &amp;&amp; ./mvnw spring-boot:run     # cong 8084</w:t>
@@ -7743,7 +7743,7 @@
       </w:r>
       <w:r>
         <w:rPr>
-          <w:rFonts w:ascii="Consolas" w:hAnsi="Consolas" w:eastAsia="Consolas"/>
+          <w:rFonts w:ascii="Courier New" w:hAnsi="Courier New" w:eastAsia="Courier New"/>
           <w:sz w:val="19"/>
         </w:rPr>
         <w:t>cd backend/order-service   &amp;&amp; ./mvnw spring-boot:run     # cong 8085</w:t>
@@ -7751,7 +7751,7 @@
       </w:r>
       <w:r>
         <w:rPr>
-          <w:rFonts w:ascii="Consolas" w:hAnsi="Consolas" w:eastAsia="Consolas"/>
+          <w:rFonts w:ascii="Courier New" w:hAnsi="Courier New" w:eastAsia="Courier New"/>
           <w:sz w:val="19"/>
         </w:rPr>
         <w:t>cd backend/api-gateway     &amp;&amp; ./mvnw spring-boot:run     # cong 8080</w:t>
@@ -7771,7 +7771,7 @@
       </w:r>
       <w:r>
         <w:rPr>
-          <w:rFonts w:ascii="Consolas" w:hAnsi="Consolas" w:eastAsia="Consolas"/>
+          <w:rFonts w:ascii="Courier New" w:hAnsi="Courier New" w:eastAsia="Courier New"/>
           <w:b w:val="0"/>
           <w:i w:val="0"/>
           <w:sz w:val="21"/>
@@ -7788,7 +7788,7 @@
       </w:r>
       <w:r>
         <w:rPr>
-          <w:rFonts w:ascii="Consolas" w:hAnsi="Consolas" w:eastAsia="Consolas"/>
+          <w:rFonts w:ascii="Courier New" w:hAnsi="Courier New" w:eastAsia="Courier New"/>
           <w:b w:val="0"/>
           <w:i w:val="0"/>
           <w:sz w:val="21"/>
@@ -7805,7 +7805,7 @@
       </w:r>
       <w:r>
         <w:rPr>
-          <w:rFonts w:ascii="Consolas" w:hAnsi="Consolas" w:eastAsia="Consolas"/>
+          <w:rFonts w:ascii="Courier New" w:hAnsi="Courier New" w:eastAsia="Courier New"/>
           <w:b w:val="0"/>
           <w:i w:val="0"/>
           <w:sz w:val="21"/>
@@ -7823,19 +7823,19 @@
     </w:p>
     <w:p>
       <w:pPr>
-        <w:spacing w:before="120" w:after="120" w:line="264" w:lineRule="auto"/>
-        <w:ind w:left="170"/>
-        <w:shd w:val="clear" w:fill="F4F4F4"/>
         <w:pBdr>
           <w:top w:val="single" w:sz="6" w:space="4" w:color="C9C9C9"/>
           <w:left w:val="single" w:sz="6" w:space="4" w:color="C9C9C9"/>
           <w:bottom w:val="single" w:sz="6" w:space="4" w:color="C9C9C9"/>
           <w:right w:val="single" w:sz="6" w:space="4" w:color="C9C9C9"/>
         </w:pBdr>
-      </w:pPr>
-      <w:r>
-        <w:rPr>
-          <w:rFonts w:ascii="Consolas" w:hAnsi="Consolas" w:eastAsia="Consolas"/>
+        <w:shd w:val="clear" w:fill="F4F4F4"/>
+        <w:spacing w:before="120" w:after="120" w:line="264" w:lineRule="auto"/>
+        <w:ind w:left="170"/>
+      </w:pPr>
+      <w:r>
+        <w:rPr>
+          <w:rFonts w:ascii="Courier New" w:hAnsi="Courier New" w:eastAsia="Courier New"/>
           <w:sz w:val="19"/>
         </w:rPr>
         <w:t>chmod +x backend/*/mvnw</w:t>
@@ -7856,19 +7856,19 @@
     </w:p>
     <w:p>
       <w:pPr>
-        <w:spacing w:before="120" w:after="120" w:line="264" w:lineRule="auto"/>
-        <w:ind w:left="170"/>
-        <w:shd w:val="clear" w:fill="F4F4F4"/>
         <w:pBdr>
           <w:top w:val="single" w:sz="6" w:space="4" w:color="C9C9C9"/>
           <w:left w:val="single" w:sz="6" w:space="4" w:color="C9C9C9"/>
           <w:bottom w:val="single" w:sz="6" w:space="4" w:color="C9C9C9"/>
           <w:right w:val="single" w:sz="6" w:space="4" w:color="C9C9C9"/>
         </w:pBdr>
-      </w:pPr>
-      <w:r>
-        <w:rPr>
-          <w:rFonts w:ascii="Consolas" w:hAnsi="Consolas" w:eastAsia="Consolas"/>
+        <w:shd w:val="clear" w:fill="F4F4F4"/>
+        <w:spacing w:before="120" w:after="120" w:line="264" w:lineRule="auto"/>
+        <w:ind w:left="170"/>
+      </w:pPr>
+      <w:r>
+        <w:rPr>
+          <w:rFonts w:ascii="Courier New" w:hAnsi="Courier New" w:eastAsia="Courier New"/>
           <w:sz w:val="19"/>
         </w:rPr>
         <w:t>Started AuthServiceApplication in 2.414 seconds (process running for 2.575)</w:t>
@@ -7889,19 +7889,19 @@
     </w:p>
     <w:p>
       <w:pPr>
-        <w:spacing w:before="120" w:after="120" w:line="264" w:lineRule="auto"/>
-        <w:ind w:left="170"/>
-        <w:shd w:val="clear" w:fill="F4F4F4"/>
         <w:pBdr>
           <w:top w:val="single" w:sz="6" w:space="4" w:color="C9C9C9"/>
           <w:left w:val="single" w:sz="6" w:space="4" w:color="C9C9C9"/>
           <w:bottom w:val="single" w:sz="6" w:space="4" w:color="C9C9C9"/>
           <w:right w:val="single" w:sz="6" w:space="4" w:color="C9C9C9"/>
         </w:pBdr>
-      </w:pPr>
-      <w:r>
-        <w:rPr>
-          <w:rFonts w:ascii="Consolas" w:hAnsi="Consolas" w:eastAsia="Consolas"/>
+        <w:shd w:val="clear" w:fill="F4F4F4"/>
+        <w:spacing w:before="120" w:after="120" w:line="264" w:lineRule="auto"/>
+        <w:ind w:left="170"/>
+      </w:pPr>
+      <w:r>
+        <w:rPr>
+          <w:rFonts w:ascii="Courier New" w:hAnsi="Courier New" w:eastAsia="Courier New"/>
           <w:sz w:val="19"/>
         </w:rPr>
         <w:t>curl http://localhost:8080/api/products</w:t>
@@ -7909,7 +7909,7 @@
       </w:r>
       <w:r>
         <w:rPr>
-          <w:rFonts w:ascii="Consolas" w:hAnsi="Consolas" w:eastAsia="Consolas"/>
+          <w:rFonts w:ascii="Courier New" w:hAnsi="Courier New" w:eastAsia="Courier New"/>
           <w:sz w:val="19"/>
         </w:rPr>
         <w:t># tra ve [] hoac danh sach san pham la dung</w:t>
@@ -7925,19 +7925,19 @@
     </w:p>
     <w:p>
       <w:pPr>
-        <w:spacing w:before="120" w:after="120" w:line="264" w:lineRule="auto"/>
-        <w:ind w:left="170"/>
-        <w:shd w:val="clear" w:fill="F4F4F4"/>
         <w:pBdr>
           <w:top w:val="single" w:sz="6" w:space="4" w:color="C9C9C9"/>
           <w:left w:val="single" w:sz="6" w:space="4" w:color="C9C9C9"/>
           <w:bottom w:val="single" w:sz="6" w:space="4" w:color="C9C9C9"/>
           <w:right w:val="single" w:sz="6" w:space="4" w:color="C9C9C9"/>
         </w:pBdr>
-      </w:pPr>
-      <w:r>
-        <w:rPr>
-          <w:rFonts w:ascii="Consolas" w:hAnsi="Consolas" w:eastAsia="Consolas"/>
+        <w:shd w:val="clear" w:fill="F4F4F4"/>
+        <w:spacing w:before="120" w:after="120" w:line="264" w:lineRule="auto"/>
+        <w:ind w:left="170"/>
+      </w:pPr>
+      <w:r>
+        <w:rPr>
+          <w:rFonts w:ascii="Courier New" w:hAnsi="Courier New" w:eastAsia="Courier New"/>
           <w:sz w:val="19"/>
         </w:rPr>
         <w:t>cd frontend</w:t>
@@ -7945,7 +7945,7 @@
       </w:r>
       <w:r>
         <w:rPr>
-          <w:rFonts w:ascii="Consolas" w:hAnsi="Consolas" w:eastAsia="Consolas"/>
+          <w:rFonts w:ascii="Courier New" w:hAnsi="Courier New" w:eastAsia="Courier New"/>
           <w:sz w:val="19"/>
         </w:rPr>
         <w:t>npm install        # chi can chay lan dau</w:t>
@@ -7953,7 +7953,7 @@
       </w:r>
       <w:r>
         <w:rPr>
-          <w:rFonts w:ascii="Consolas" w:hAnsi="Consolas" w:eastAsia="Consolas"/>
+          <w:rFonts w:ascii="Courier New" w:hAnsi="Courier New" w:eastAsia="Courier New"/>
           <w:sz w:val="19"/>
         </w:rPr>
         <w:t>npm run dev</w:t>
@@ -7973,7 +7973,7 @@
       </w:r>
       <w:r>
         <w:rPr>
-          <w:rFonts w:ascii="Consolas" w:hAnsi="Consolas" w:eastAsia="Consolas"/>
+          <w:rFonts w:ascii="Courier New" w:hAnsi="Courier New" w:eastAsia="Courier New"/>
           <w:b w:val="0"/>
           <w:i w:val="0"/>
           <w:sz w:val="21"/>
@@ -7990,7 +7990,7 @@
       </w:r>
       <w:r>
         <w:rPr>
-          <w:rFonts w:ascii="Consolas" w:hAnsi="Consolas" w:eastAsia="Consolas"/>
+          <w:rFonts w:ascii="Courier New" w:hAnsi="Courier New" w:eastAsia="Courier New"/>
           <w:b w:val="0"/>
           <w:i w:val="0"/>
           <w:sz w:val="21"/>
@@ -8008,19 +8008,19 @@
     </w:p>
     <w:p>
       <w:pPr>
-        <w:spacing w:before="120" w:after="120" w:line="264" w:lineRule="auto"/>
-        <w:ind w:left="170"/>
-        <w:shd w:val="clear" w:fill="F4F4F4"/>
         <w:pBdr>
           <w:top w:val="single" w:sz="6" w:space="4" w:color="C9C9C9"/>
           <w:left w:val="single" w:sz="6" w:space="4" w:color="C9C9C9"/>
           <w:bottom w:val="single" w:sz="6" w:space="4" w:color="C9C9C9"/>
           <w:right w:val="single" w:sz="6" w:space="4" w:color="C9C9C9"/>
         </w:pBdr>
-      </w:pPr>
-      <w:r>
-        <w:rPr>
-          <w:rFonts w:ascii="Consolas" w:hAnsi="Consolas" w:eastAsia="Consolas"/>
+        <w:shd w:val="clear" w:fill="F4F4F4"/>
+        <w:spacing w:before="120" w:after="120" w:line="264" w:lineRule="auto"/>
+        <w:ind w:left="170"/>
+      </w:pPr>
+      <w:r>
+        <w:rPr>
+          <w:rFonts w:ascii="Courier New" w:hAnsi="Courier New" w:eastAsia="Courier New"/>
           <w:sz w:val="19"/>
         </w:rPr>
         <w:t>NEXT_PUBLIC_API_BASE_URL=http://localhost:8080</w:t>
@@ -8049,19 +8049,19 @@
     </w:p>
     <w:p>
       <w:pPr>
-        <w:spacing w:before="120" w:after="120" w:line="264" w:lineRule="auto"/>
-        <w:ind w:left="170"/>
-        <w:shd w:val="clear" w:fill="F4F4F4"/>
         <w:pBdr>
           <w:top w:val="single" w:sz="6" w:space="4" w:color="C9C9C9"/>
           <w:left w:val="single" w:sz="6" w:space="4" w:color="C9C9C9"/>
           <w:bottom w:val="single" w:sz="6" w:space="4" w:color="C9C9C9"/>
           <w:right w:val="single" w:sz="6" w:space="4" w:color="C9C9C9"/>
         </w:pBdr>
-      </w:pPr>
-      <w:r>
-        <w:rPr>
-          <w:rFonts w:ascii="Consolas" w:hAnsi="Consolas" w:eastAsia="Consolas"/>
+        <w:shd w:val="clear" w:fill="F4F4F4"/>
+        <w:spacing w:before="120" w:after="120" w:line="264" w:lineRule="auto"/>
+        <w:ind w:left="170"/>
+      </w:pPr>
+      <w:r>
+        <w:rPr>
+          <w:rFonts w:ascii="Courier New" w:hAnsi="Courier New" w:eastAsia="Courier New"/>
           <w:sz w:val="19"/>
         </w:rPr>
         <w:t># 1. Dang ky mot tai khoan tren trang /login, vi du admin@nhom14.vn</w:t>
@@ -8069,14 +8069,14 @@
       </w:r>
       <w:r>
         <w:rPr>
-          <w:rFonts w:ascii="Consolas" w:hAnsi="Consolas" w:eastAsia="Consolas"/>
+          <w:rFonts w:ascii="Courier New" w:hAnsi="Courier New" w:eastAsia="Courier New"/>
           <w:sz w:val="19"/>
         </w:rPr>
         <w:br/>
       </w:r>
       <w:r>
         <w:rPr>
-          <w:rFonts w:ascii="Consolas" w:hAnsi="Consolas" w:eastAsia="Consolas"/>
+          <w:rFonts w:ascii="Courier New" w:hAnsi="Courier New" w:eastAsia="Courier New"/>
           <w:sz w:val="19"/>
         </w:rPr>
         <w:t># 2. Xem ma tai khoan vua dang ky</w:t>
@@ -8084,7 +8084,7 @@
       </w:r>
       <w:r>
         <w:rPr>
-          <w:rFonts w:ascii="Consolas" w:hAnsi="Consolas" w:eastAsia="Consolas"/>
+          <w:rFonts w:ascii="Courier New" w:hAnsi="Courier New" w:eastAsia="Courier New"/>
           <w:sz w:val="19"/>
         </w:rPr>
         <w:t>docker exec mysql-auth mysql -uroot -proot -D db_auth \</w:t>
@@ -8092,7 +8092,7 @@
       </w:r>
       <w:r>
         <w:rPr>
-          <w:rFonts w:ascii="Consolas" w:hAnsi="Consolas" w:eastAsia="Consolas"/>
+          <w:rFonts w:ascii="Courier New" w:hAnsi="Courier New" w:eastAsia="Courier New"/>
           <w:sz w:val="19"/>
         </w:rPr>
         <w:t xml:space="preserve">  -e "SELECT id, email FROM accounts;"</w:t>
@@ -8100,14 +8100,14 @@
       </w:r>
       <w:r>
         <w:rPr>
-          <w:rFonts w:ascii="Consolas" w:hAnsi="Consolas" w:eastAsia="Consolas"/>
+          <w:rFonts w:ascii="Courier New" w:hAnsi="Courier New" w:eastAsia="Courier New"/>
           <w:sz w:val="19"/>
         </w:rPr>
         <w:br/>
       </w:r>
       <w:r>
         <w:rPr>
-          <w:rFonts w:ascii="Consolas" w:hAnsi="Consolas" w:eastAsia="Consolas"/>
+          <w:rFonts w:ascii="Courier New" w:hAnsi="Courier New" w:eastAsia="Courier New"/>
           <w:sz w:val="19"/>
         </w:rPr>
         <w:t># 3. Cap quyen ADMIN (gia su tai khoan co id = 1)</w:t>
@@ -8115,7 +8115,7 @@
       </w:r>
       <w:r>
         <w:rPr>
-          <w:rFonts w:ascii="Consolas" w:hAnsi="Consolas" w:eastAsia="Consolas"/>
+          <w:rFonts w:ascii="Courier New" w:hAnsi="Courier New" w:eastAsia="Courier New"/>
           <w:sz w:val="19"/>
         </w:rPr>
         <w:t>docker exec mysql-auth mysql -uroot -proot -D db_auth \</w:t>
@@ -8123,7 +8123,7 @@
       </w:r>
       <w:r>
         <w:rPr>
-          <w:rFonts w:ascii="Consolas" w:hAnsi="Consolas" w:eastAsia="Consolas"/>
+          <w:rFonts w:ascii="Courier New" w:hAnsi="Courier New" w:eastAsia="Courier New"/>
           <w:sz w:val="19"/>
         </w:rPr>
         <w:t xml:space="preserve">  -e "DELETE FROM account_roles WHERE account_id = 1;</w:t>
@@ -8131,7 +8131,7 @@
       </w:r>
       <w:r>
         <w:rPr>
-          <w:rFonts w:ascii="Consolas" w:hAnsi="Consolas" w:eastAsia="Consolas"/>
+          <w:rFonts w:ascii="Courier New" w:hAnsi="Courier New" w:eastAsia="Courier New"/>
           <w:sz w:val="19"/>
         </w:rPr>
         <w:t xml:space="preserve">      INSERT INTO account_roles (account_id, role) VALUES (1, 'ADMIN');"</w:t>
@@ -8177,8 +8177,8 @@
           </w:tcPr>
           <w:p>
             <w:pPr>
+              <w:shd w:val="clear" w:fill="DCEDEA"/>
               <w:spacing w:after="40"/>
-              <w:shd w:val="clear" w:fill="DCEDEA"/>
             </w:pPr>
             <w:r/>
             <w:r>
@@ -8196,8 +8196,8 @@
           </w:tcPr>
           <w:p>
             <w:pPr>
+              <w:shd w:val="clear" w:fill="DCEDEA"/>
               <w:spacing w:after="40"/>
-              <w:shd w:val="clear" w:fill="DCEDEA"/>
             </w:pPr>
             <w:r/>
             <w:r>
@@ -8215,8 +8215,8 @@
           </w:tcPr>
           <w:p>
             <w:pPr>
+              <w:shd w:val="clear" w:fill="DCEDEA"/>
               <w:spacing w:after="40"/>
-              <w:shd w:val="clear" w:fill="DCEDEA"/>
             </w:pPr>
             <w:r/>
             <w:r>
@@ -8726,7 +8726,7 @@
       </w:r>
       <w:r>
         <w:rPr>
-          <w:rFonts w:ascii="Consolas" w:hAnsi="Consolas" w:eastAsia="Consolas"/>
+          <w:rFonts w:ascii="Courier New" w:hAnsi="Courier New" w:eastAsia="Courier New"/>
           <w:b w:val="0"/>
           <w:i w:val="0"/>
           <w:sz w:val="21"/>
@@ -8743,7 +8743,7 @@
       </w:r>
       <w:r>
         <w:rPr>
-          <w:rFonts w:ascii="Consolas" w:hAnsi="Consolas" w:eastAsia="Consolas"/>
+          <w:rFonts w:ascii="Courier New" w:hAnsi="Courier New" w:eastAsia="Courier New"/>
           <w:b w:val="0"/>
           <w:i w:val="0"/>
           <w:sz w:val="21"/>
@@ -8769,19 +8769,19 @@
     </w:p>
     <w:p>
       <w:pPr>
-        <w:spacing w:before="120" w:after="120" w:line="264" w:lineRule="auto"/>
-        <w:ind w:left="170"/>
-        <w:shd w:val="clear" w:fill="F4F4F4"/>
         <w:pBdr>
           <w:top w:val="single" w:sz="6" w:space="4" w:color="C9C9C9"/>
           <w:left w:val="single" w:sz="6" w:space="4" w:color="C9C9C9"/>
           <w:bottom w:val="single" w:sz="6" w:space="4" w:color="C9C9C9"/>
           <w:right w:val="single" w:sz="6" w:space="4" w:color="C9C9C9"/>
         </w:pBdr>
-      </w:pPr>
-      <w:r>
-        <w:rPr>
-          <w:rFonts w:ascii="Consolas" w:hAnsi="Consolas" w:eastAsia="Consolas"/>
+        <w:shd w:val="clear" w:fill="F4F4F4"/>
+        <w:spacing w:before="120" w:after="120" w:line="264" w:lineRule="auto"/>
+        <w:ind w:left="170"/>
+      </w:pPr>
+      <w:r>
+        <w:rPr>
+          <w:rFonts w:ascii="Courier New" w:hAnsi="Courier New" w:eastAsia="Courier New"/>
           <w:sz w:val="19"/>
         </w:rPr>
         <w:t># tat backend: nhan Ctrl + C trong tung terminal</w:t>
@@ -8789,7 +8789,7 @@
       </w:r>
       <w:r>
         <w:rPr>
-          <w:rFonts w:ascii="Consolas" w:hAnsi="Consolas" w:eastAsia="Consolas"/>
+          <w:rFonts w:ascii="Courier New" w:hAnsi="Courier New" w:eastAsia="Courier New"/>
           <w:sz w:val="19"/>
         </w:rPr>
         <w:t># hoac tat tat ca cung luc (macOS/Linux):</w:t>
@@ -8797,7 +8797,7 @@
       </w:r>
       <w:r>
         <w:rPr>
-          <w:rFonts w:ascii="Consolas" w:hAnsi="Consolas" w:eastAsia="Consolas"/>
+          <w:rFonts w:ascii="Courier New" w:hAnsi="Courier New" w:eastAsia="Courier New"/>
           <w:sz w:val="19"/>
         </w:rPr>
         <w:t>pkill -f "spring-boot:run"</w:t>
@@ -8805,14 +8805,14 @@
       </w:r>
       <w:r>
         <w:rPr>
-          <w:rFonts w:ascii="Consolas" w:hAnsi="Consolas" w:eastAsia="Consolas"/>
+          <w:rFonts w:ascii="Courier New" w:hAnsi="Courier New" w:eastAsia="Courier New"/>
           <w:sz w:val="19"/>
         </w:rPr>
         <w:br/>
       </w:r>
       <w:r>
         <w:rPr>
-          <w:rFonts w:ascii="Consolas" w:hAnsi="Consolas" w:eastAsia="Consolas"/>
+          <w:rFonts w:ascii="Courier New" w:hAnsi="Courier New" w:eastAsia="Courier New"/>
           <w:sz w:val="19"/>
         </w:rPr>
         <w:t># tat frontend: Ctrl + C</w:t>
@@ -8820,14 +8820,14 @@
       </w:r>
       <w:r>
         <w:rPr>
-          <w:rFonts w:ascii="Consolas" w:hAnsi="Consolas" w:eastAsia="Consolas"/>
+          <w:rFonts w:ascii="Courier New" w:hAnsi="Courier New" w:eastAsia="Courier New"/>
           <w:sz w:val="19"/>
         </w:rPr>
         <w:br/>
       </w:r>
       <w:r>
         <w:rPr>
-          <w:rFonts w:ascii="Consolas" w:hAnsi="Consolas" w:eastAsia="Consolas"/>
+          <w:rFonts w:ascii="Courier New" w:hAnsi="Courier New" w:eastAsia="Courier New"/>
           <w:sz w:val="19"/>
         </w:rPr>
         <w:t># tat database nhung giu lai du lieu</w:t>
@@ -8835,7 +8835,7 @@
       </w:r>
       <w:r>
         <w:rPr>
-          <w:rFonts w:ascii="Consolas" w:hAnsi="Consolas" w:eastAsia="Consolas"/>
+          <w:rFonts w:ascii="Courier New" w:hAnsi="Courier New" w:eastAsia="Courier New"/>
           <w:sz w:val="19"/>
         </w:rPr>
         <w:t>docker compose -f infra/docker-compose.dev.yml stop</w:t>
@@ -8843,14 +8843,14 @@
       </w:r>
       <w:r>
         <w:rPr>
-          <w:rFonts w:ascii="Consolas" w:hAnsi="Consolas" w:eastAsia="Consolas"/>
+          <w:rFonts w:ascii="Courier New" w:hAnsi="Courier New" w:eastAsia="Courier New"/>
           <w:sz w:val="19"/>
         </w:rPr>
         <w:br/>
       </w:r>
       <w:r>
         <w:rPr>
-          <w:rFonts w:ascii="Consolas" w:hAnsi="Consolas" w:eastAsia="Consolas"/>
+          <w:rFonts w:ascii="Courier New" w:hAnsi="Courier New" w:eastAsia="Courier New"/>
           <w:sz w:val="19"/>
         </w:rPr>
         <w:t># xoa han container va toan bo du lieu</w:t>
@@ -8858,7 +8858,7 @@
       </w:r>
       <w:r>
         <w:rPr>
-          <w:rFonts w:ascii="Consolas" w:hAnsi="Consolas" w:eastAsia="Consolas"/>
+          <w:rFonts w:ascii="Courier New" w:hAnsi="Courier New" w:eastAsia="Courier New"/>
           <w:sz w:val="19"/>
         </w:rPr>
         <w:t>docker compose -f infra/docker-compose.dev.yml down -v</w:t>
@@ -8917,8 +8917,8 @@
           </w:tcPr>
           <w:p>
             <w:pPr>
+              <w:shd w:val="clear" w:fill="DCEDEA"/>
               <w:spacing w:after="40"/>
-              <w:shd w:val="clear" w:fill="DCEDEA"/>
             </w:pPr>
             <w:r/>
             <w:r>
@@ -8936,8 +8936,8 @@
           </w:tcPr>
           <w:p>
             <w:pPr>
+              <w:shd w:val="clear" w:fill="DCEDEA"/>
               <w:spacing w:after="40"/>
-              <w:shd w:val="clear" w:fill="DCEDEA"/>
             </w:pPr>
             <w:r/>
             <w:r>
@@ -8955,8 +8955,8 @@
           </w:tcPr>
           <w:p>
             <w:pPr>
+              <w:shd w:val="clear" w:fill="DCEDEA"/>
               <w:spacing w:after="40"/>
-              <w:shd w:val="clear" w:fill="DCEDEA"/>
             </w:pPr>
             <w:r/>
             <w:r>
@@ -9313,8 +9313,8 @@
           </w:tcPr>
           <w:p>
             <w:pPr>
+              <w:shd w:val="clear" w:fill="FAFAFA"/>
               <w:jc w:val="center"/>
-              <w:shd w:val="clear" w:fill="FAFAFA"/>
             </w:pPr>
             <w:r>
               <w:rPr>
@@ -9387,8 +9387,8 @@
           </w:tcPr>
           <w:p>
             <w:pPr>
+              <w:shd w:val="clear" w:fill="FAFAFA"/>
               <w:jc w:val="center"/>
-              <w:shd w:val="clear" w:fill="FAFAFA"/>
             </w:pPr>
             <w:r>
               <w:rPr>
@@ -9466,8 +9466,8 @@
           </w:tcPr>
           <w:p>
             <w:pPr>
+              <w:shd w:val="clear" w:fill="FAFAFA"/>
               <w:jc w:val="center"/>
-              <w:shd w:val="clear" w:fill="FAFAFA"/>
             </w:pPr>
             <w:r>
               <w:rPr>
@@ -9540,8 +9540,8 @@
           </w:tcPr>
           <w:p>
             <w:pPr>
+              <w:shd w:val="clear" w:fill="FAFAFA"/>
               <w:jc w:val="center"/>
-              <w:shd w:val="clear" w:fill="FAFAFA"/>
             </w:pPr>
             <w:r>
               <w:rPr>
@@ -9619,8 +9619,8 @@
           </w:tcPr>
           <w:p>
             <w:pPr>
+              <w:shd w:val="clear" w:fill="FAFAFA"/>
               <w:jc w:val="center"/>
-              <w:shd w:val="clear" w:fill="FAFAFA"/>
             </w:pPr>
             <w:r>
               <w:rPr>
@@ -9693,8 +9693,8 @@
           </w:tcPr>
           <w:p>
             <w:pPr>
+              <w:shd w:val="clear" w:fill="FAFAFA"/>
               <w:jc w:val="center"/>
-              <w:shd w:val="clear" w:fill="FAFAFA"/>
             </w:pPr>
             <w:r>
               <w:rPr>
@@ -9772,8 +9772,8 @@
           </w:tcPr>
           <w:p>
             <w:pPr>
+              <w:shd w:val="clear" w:fill="FAFAFA"/>
               <w:jc w:val="center"/>
-              <w:shd w:val="clear" w:fill="FAFAFA"/>
             </w:pPr>
             <w:r>
               <w:rPr>
@@ -9846,8 +9846,8 @@
           </w:tcPr>
           <w:p>
             <w:pPr>
+              <w:shd w:val="clear" w:fill="FAFAFA"/>
               <w:jc w:val="center"/>
-              <w:shd w:val="clear" w:fill="FAFAFA"/>
             </w:pPr>
             <w:r>
               <w:rPr>
@@ -9925,8 +9925,8 @@
           </w:tcPr>
           <w:p>
             <w:pPr>
+              <w:shd w:val="clear" w:fill="FAFAFA"/>
               <w:jc w:val="center"/>
-              <w:shd w:val="clear" w:fill="FAFAFA"/>
             </w:pPr>
             <w:r>
               <w:rPr>
@@ -9999,8 +9999,8 @@
           </w:tcPr>
           <w:p>
             <w:pPr>
+              <w:shd w:val="clear" w:fill="FAFAFA"/>
               <w:jc w:val="center"/>
-              <w:shd w:val="clear" w:fill="FAFAFA"/>
             </w:pPr>
             <w:r>
               <w:rPr>
@@ -10078,8 +10078,8 @@
           </w:tcPr>
           <w:p>
             <w:pPr>
+              <w:shd w:val="clear" w:fill="FAFAFA"/>
               <w:jc w:val="center"/>
-              <w:shd w:val="clear" w:fill="FAFAFA"/>
             </w:pPr>
             <w:r>
               <w:rPr>
@@ -10152,8 +10152,8 @@
           </w:tcPr>
           <w:p>
             <w:pPr>
+              <w:shd w:val="clear" w:fill="FAFAFA"/>
               <w:jc w:val="center"/>
-              <w:shd w:val="clear" w:fill="FAFAFA"/>
             </w:pPr>
             <w:r>
               <w:rPr>
@@ -10231,8 +10231,8 @@
           </w:tcPr>
           <w:p>
             <w:pPr>
+              <w:shd w:val="clear" w:fill="FAFAFA"/>
               <w:jc w:val="center"/>
-              <w:shd w:val="clear" w:fill="FAFAFA"/>
             </w:pPr>
             <w:r>
               <w:rPr>
@@ -10305,8 +10305,8 @@
           </w:tcPr>
           <w:p>
             <w:pPr>
+              <w:shd w:val="clear" w:fill="FAFAFA"/>
               <w:jc w:val="center"/>
-              <w:shd w:val="clear" w:fill="FAFAFA"/>
             </w:pPr>
             <w:r>
               <w:rPr>
@@ -10394,7 +10394,7 @@
       </w:r>
       <w:r>
         <w:rPr>
-          <w:rFonts w:ascii="Consolas" w:hAnsi="Consolas" w:eastAsia="Consolas"/>
+          <w:rFonts w:ascii="Courier New" w:hAnsi="Courier New" w:eastAsia="Courier New"/>
           <w:b w:val="0"/>
           <w:i w:val="0"/>
           <w:sz w:val="21"/>
@@ -10411,7 +10411,7 @@
       </w:r>
       <w:r>
         <w:rPr>
-          <w:rFonts w:ascii="Consolas" w:hAnsi="Consolas" w:eastAsia="Consolas"/>
+          <w:rFonts w:ascii="Courier New" w:hAnsi="Courier New" w:eastAsia="Courier New"/>
           <w:b w:val="0"/>
           <w:i w:val="0"/>
           <w:sz w:val="21"/>
@@ -10428,7 +10428,7 @@
       </w:r>
       <w:r>
         <w:rPr>
-          <w:rFonts w:ascii="Consolas" w:hAnsi="Consolas" w:eastAsia="Consolas"/>
+          <w:rFonts w:ascii="Courier New" w:hAnsi="Courier New" w:eastAsia="Courier New"/>
           <w:b w:val="0"/>
           <w:i w:val="0"/>
           <w:sz w:val="21"/>
@@ -10445,7 +10445,7 @@
       </w:r>
       <w:r>
         <w:rPr>
-          <w:rFonts w:ascii="Consolas" w:hAnsi="Consolas" w:eastAsia="Consolas"/>
+          <w:rFonts w:ascii="Courier New" w:hAnsi="Courier New" w:eastAsia="Courier New"/>
           <w:b w:val="0"/>
           <w:i w:val="0"/>
           <w:sz w:val="21"/>
@@ -10483,7 +10483,7 @@
       </w:r>
       <w:r>
         <w:rPr>
-          <w:rFonts w:ascii="Consolas" w:hAnsi="Consolas" w:eastAsia="Consolas"/>
+          <w:rFonts w:ascii="Courier New" w:hAnsi="Courier New" w:eastAsia="Courier New"/>
           <w:b w:val="0"/>
           <w:i w:val="0"/>
           <w:sz w:val="21"/>
@@ -10500,7 +10500,7 @@
       </w:r>
       <w:r>
         <w:rPr>
-          <w:rFonts w:ascii="Consolas" w:hAnsi="Consolas" w:eastAsia="Consolas"/>
+          <w:rFonts w:ascii="Courier New" w:hAnsi="Courier New" w:eastAsia="Courier New"/>
           <w:b w:val="0"/>
           <w:i w:val="0"/>
           <w:sz w:val="21"/>
@@ -10651,7 +10651,7 @@
       </w:r>
       <w:r>
         <w:rPr>
-          <w:rFonts w:ascii="Consolas" w:hAnsi="Consolas" w:eastAsia="Consolas"/>
+          <w:rFonts w:ascii="Courier New" w:hAnsi="Courier New" w:eastAsia="Courier New"/>
           <w:b w:val="0"/>
           <w:i w:val="0"/>
           <w:sz w:val="21"/>
@@ -10854,8 +10854,8 @@
           </w:tcPr>
           <w:p>
             <w:pPr>
+              <w:shd w:val="clear" w:fill="DCEDEA"/>
               <w:spacing w:after="40"/>
-              <w:shd w:val="clear" w:fill="DCEDEA"/>
             </w:pPr>
             <w:r/>
             <w:r>
@@ -10873,8 +10873,8 @@
           </w:tcPr>
           <w:p>
             <w:pPr>
+              <w:shd w:val="clear" w:fill="DCEDEA"/>
               <w:spacing w:after="40"/>
-              <w:shd w:val="clear" w:fill="DCEDEA"/>
             </w:pPr>
             <w:r/>
             <w:r>
@@ -10892,8 +10892,8 @@
           </w:tcPr>
           <w:p>
             <w:pPr>
+              <w:shd w:val="clear" w:fill="DCEDEA"/>
               <w:spacing w:after="40"/>
-              <w:shd w:val="clear" w:fill="DCEDEA"/>
             </w:pPr>
             <w:r/>
             <w:r>

</xml_diff>